<commit_message>
docs(rescue): add Rescue Tested Trades to user/technical/API manuals + rebuild
Co-Authored-By: Claude Opus 4.8 <noreply@anthropic.com>
</commit_message>
<xml_diff>
--- a/docs/manuals/api-reference/api-reference.docx
+++ b/docs/manuals/api-reference/api-reference.docx
@@ -2317,6 +2317,462 @@
           </w:p>
         </w:tc>
       </w:tr>
+      <w:tr>
+        <w:tc>
+          <w:tcPr>
+            <w:tcW w:type="dxa" w:w="2160"/>
+          </w:tcPr>
+          <w:p>
+            <w:r/>
+            <w:r>
+              <w:rPr>
+                <w:rFonts w:ascii="Consolas" w:hAnsi="Consolas"/>
+                <w:color w:val="334455"/>
+                <w:sz w:val="19"/>
+              </w:rPr>
+              <w:t>RescueAdvisory</w:t>
+            </w:r>
+          </w:p>
+        </w:tc>
+        <w:tc>
+          <w:tcPr>
+            <w:tcW w:type="dxa" w:w="2160"/>
+          </w:tcPr>
+          <w:p>
+            <w:r/>
+            <w:r>
+              <w:rPr>
+                <w:rFonts w:ascii="Consolas" w:hAnsi="Consolas"/>
+                <w:color w:val="334455"/>
+                <w:sz w:val="19"/>
+              </w:rPr>
+              <w:t>options.py</w:t>
+            </w:r>
+          </w:p>
+        </w:tc>
+        <w:tc>
+          <w:tcPr>
+            <w:tcW w:type="dxa" w:w="2160"/>
+          </w:tcPr>
+          <w:p>
+            <w:r/>
+            <w:r>
+              <w:rPr>
+                <w:rFonts w:ascii="Consolas" w:hAnsi="Consolas"/>
+                <w:color w:val="334455"/>
+                <w:sz w:val="19"/>
+              </w:rPr>
+              <w:t>cache:options:rescue:&lt;position_id&gt;</w:t>
+            </w:r>
+          </w:p>
+        </w:tc>
+        <w:tc>
+          <w:tcPr>
+            <w:tcW w:type="dxa" w:w="2160"/>
+          </w:tcPr>
+          <w:p>
+            <w:r/>
+            <w:r>
+              <w:rPr>
+                <w:rFonts w:ascii="Consolas" w:hAnsi="Consolas"/>
+                <w:color w:val="334455"/>
+                <w:sz w:val="19"/>
+              </w:rPr>
+              <w:t>position_id</w:t>
+            </w:r>
+            <w:r>
+              <w:rPr/>
+              <w:t xml:space="preserve">, </w:t>
+            </w:r>
+            <w:r>
+              <w:rPr>
+                <w:rFonts w:ascii="Consolas" w:hAnsi="Consolas"/>
+                <w:color w:val="334455"/>
+                <w:sz w:val="19"/>
+              </w:rPr>
+              <w:t>symbol</w:t>
+            </w:r>
+            <w:r>
+              <w:rPr/>
+              <w:t xml:space="preserve">, </w:t>
+            </w:r>
+            <w:r>
+              <w:rPr>
+                <w:rFonts w:ascii="Consolas" w:hAnsi="Consolas"/>
+                <w:color w:val="334455"/>
+                <w:sz w:val="19"/>
+              </w:rPr>
+              <w:t>strategy</w:t>
+            </w:r>
+            <w:r>
+              <w:rPr/>
+              <w:t xml:space="preserve">, </w:t>
+            </w:r>
+            <w:r>
+              <w:rPr>
+                <w:rFonts w:ascii="Consolas" w:hAnsi="Consolas"/>
+                <w:color w:val="334455"/>
+                <w:sz w:val="19"/>
+              </w:rPr>
+              <w:t>state</w:t>
+            </w:r>
+            <w:r>
+              <w:rPr/>
+              <w:t xml:space="preserve">, </w:t>
+            </w:r>
+            <w:r>
+              <w:rPr>
+                <w:rFonts w:ascii="Consolas" w:hAnsi="Consolas"/>
+                <w:color w:val="334455"/>
+                <w:sz w:val="19"/>
+              </w:rPr>
+              <w:t>heat</w:t>
+            </w:r>
+            <w:r>
+              <w:rPr/>
+              <w:t xml:space="preserve">, </w:t>
+            </w:r>
+            <w:r>
+              <w:rPr>
+                <w:rFonts w:ascii="Consolas" w:hAnsi="Consolas"/>
+                <w:color w:val="334455"/>
+                <w:sz w:val="19"/>
+              </w:rPr>
+              <w:t>mark</w:t>
+            </w:r>
+            <w:r>
+              <w:rPr/>
+              <w:t xml:space="preserve">, </w:t>
+            </w:r>
+            <w:r>
+              <w:rPr>
+                <w:rFonts w:ascii="Consolas" w:hAnsi="Consolas"/>
+                <w:color w:val="334455"/>
+                <w:sz w:val="19"/>
+              </w:rPr>
+              <w:t>context[]</w:t>
+            </w:r>
+            <w:r>
+              <w:rPr/>
+              <w:t xml:space="preserve">, </w:t>
+            </w:r>
+            <w:r>
+              <w:rPr>
+                <w:rFonts w:ascii="Consolas" w:hAnsi="Consolas"/>
+                <w:color w:val="334455"/>
+                <w:sz w:val="19"/>
+              </w:rPr>
+              <w:t>candidates[]</w:t>
+            </w:r>
+            <w:r>
+              <w:rPr/>
+              <w:t xml:space="preserve">, </w:t>
+            </w:r>
+            <w:r>
+              <w:rPr>
+                <w:rFonts w:ascii="Consolas" w:hAnsi="Consolas"/>
+                <w:color w:val="334455"/>
+                <w:sz w:val="19"/>
+              </w:rPr>
+              <w:t>error</w:t>
+            </w:r>
+          </w:p>
+        </w:tc>
+      </w:tr>
+      <w:tr>
+        <w:tc>
+          <w:tcPr>
+            <w:tcW w:type="dxa" w:w="2160"/>
+            <w:shd w:val="clear" w:color="auto" w:fill="F4F6FA"/>
+          </w:tcPr>
+          <w:p>
+            <w:r/>
+            <w:r>
+              <w:rPr>
+                <w:rFonts w:ascii="Consolas" w:hAnsi="Consolas"/>
+                <w:color w:val="334455"/>
+                <w:sz w:val="19"/>
+              </w:rPr>
+              <w:t>RescueCandidate</w:t>
+            </w:r>
+          </w:p>
+        </w:tc>
+        <w:tc>
+          <w:tcPr>
+            <w:tcW w:type="dxa" w:w="2160"/>
+            <w:shd w:val="clear" w:color="auto" w:fill="F4F6FA"/>
+          </w:tcPr>
+          <w:p>
+            <w:r/>
+            <w:r>
+              <w:rPr>
+                <w:rFonts w:ascii="Consolas" w:hAnsi="Consolas"/>
+                <w:color w:val="334455"/>
+                <w:sz w:val="19"/>
+              </w:rPr>
+              <w:t>options.py</w:t>
+            </w:r>
+          </w:p>
+        </w:tc>
+        <w:tc>
+          <w:tcPr>
+            <w:tcW w:type="dxa" w:w="2160"/>
+            <w:shd w:val="clear" w:color="auto" w:fill="F4F6FA"/>
+          </w:tcPr>
+          <w:p>
+            <w:r/>
+            <w:r>
+              <w:rPr/>
+              <w:t xml:space="preserve">(embedded in </w:t>
+            </w:r>
+            <w:r>
+              <w:rPr>
+                <w:rFonts w:ascii="Consolas" w:hAnsi="Consolas"/>
+                <w:color w:val="334455"/>
+                <w:sz w:val="19"/>
+              </w:rPr>
+              <w:t>RescueAdvisory.candidates</w:t>
+            </w:r>
+            <w:r>
+              <w:rPr/>
+              <w:t>)</w:t>
+            </w:r>
+          </w:p>
+        </w:tc>
+        <w:tc>
+          <w:tcPr>
+            <w:tcW w:type="dxa" w:w="2160"/>
+            <w:shd w:val="clear" w:color="auto" w:fill="F4F6FA"/>
+          </w:tcPr>
+          <w:p>
+            <w:r/>
+            <w:r>
+              <w:rPr>
+                <w:rFonts w:ascii="Consolas" w:hAnsi="Consolas"/>
+                <w:color w:val="334455"/>
+                <w:sz w:val="19"/>
+              </w:rPr>
+              <w:t>action</w:t>
+            </w:r>
+            <w:r>
+              <w:rPr/>
+              <w:t xml:space="preserve">, </w:t>
+            </w:r>
+            <w:r>
+              <w:rPr>
+                <w:rFonts w:ascii="Consolas" w:hAnsi="Consolas"/>
+                <w:color w:val="334455"/>
+                <w:sz w:val="19"/>
+              </w:rPr>
+              <w:t>label</w:t>
+            </w:r>
+            <w:r>
+              <w:rPr/>
+              <w:t xml:space="preserve">, </w:t>
+            </w:r>
+            <w:r>
+              <w:rPr>
+                <w:rFonts w:ascii="Consolas" w:hAnsi="Consolas"/>
+                <w:color w:val="334455"/>
+                <w:sz w:val="19"/>
+              </w:rPr>
+              <w:t>apply_kind</w:t>
+            </w:r>
+            <w:r>
+              <w:rPr/>
+              <w:t xml:space="preserve"> (</w:t>
+            </w:r>
+            <w:r>
+              <w:rPr>
+                <w:rFonts w:ascii="Consolas" w:hAnsi="Consolas"/>
+                <w:color w:val="334455"/>
+                <w:sz w:val="19"/>
+              </w:rPr>
+              <w:t>execute</w:t>
+            </w:r>
+            <w:r>
+              <w:rPr/>
+              <w:t>|</w:t>
+            </w:r>
+            <w:r>
+              <w:rPr>
+                <w:rFonts w:ascii="Consolas" w:hAnsi="Consolas"/>
+                <w:color w:val="334455"/>
+                <w:sz w:val="19"/>
+              </w:rPr>
+              <w:t>advisory</w:t>
+            </w:r>
+            <w:r>
+              <w:rPr/>
+              <w:t xml:space="preserve">), </w:t>
+            </w:r>
+            <w:r>
+              <w:rPr>
+                <w:rFonts w:ascii="Consolas" w:hAnsi="Consolas"/>
+                <w:color w:val="334455"/>
+                <w:sz w:val="19"/>
+              </w:rPr>
+              <w:t>gross_cash</w:t>
+            </w:r>
+            <w:r>
+              <w:rPr/>
+              <w:t xml:space="preserve">, </w:t>
+            </w:r>
+            <w:r>
+              <w:rPr>
+                <w:rFonts w:ascii="Consolas" w:hAnsi="Consolas"/>
+                <w:color w:val="334455"/>
+                <w:sz w:val="19"/>
+              </w:rPr>
+              <w:t>commission</w:t>
+            </w:r>
+            <w:r>
+              <w:rPr/>
+              <w:t xml:space="preserve">, </w:t>
+            </w:r>
+            <w:r>
+              <w:rPr>
+                <w:rFonts w:ascii="Consolas" w:hAnsi="Consolas"/>
+                <w:color w:val="334455"/>
+                <w:sz w:val="19"/>
+              </w:rPr>
+              <w:t>net_cash</w:t>
+            </w:r>
+            <w:r>
+              <w:rPr/>
+              <w:t xml:space="preserve">, </w:t>
+            </w:r>
+            <w:r>
+              <w:rPr>
+                <w:rFonts w:ascii="Consolas" w:hAnsi="Consolas"/>
+                <w:color w:val="334455"/>
+                <w:sz w:val="19"/>
+              </w:rPr>
+              <w:t>new_max_loss</w:t>
+            </w:r>
+            <w:r>
+              <w:rPr/>
+              <w:t xml:space="preserve">, </w:t>
+            </w:r>
+            <w:r>
+              <w:rPr>
+                <w:rFonts w:ascii="Consolas" w:hAnsi="Consolas"/>
+                <w:color w:val="334455"/>
+                <w:sz w:val="19"/>
+              </w:rPr>
+              <w:t>breakeven</w:t>
+            </w:r>
+            <w:r>
+              <w:rPr/>
+              <w:t xml:space="preserve">, </w:t>
+            </w:r>
+            <w:r>
+              <w:rPr>
+                <w:rFonts w:ascii="Consolas" w:hAnsi="Consolas"/>
+                <w:color w:val="334455"/>
+                <w:sz w:val="19"/>
+              </w:rPr>
+              <w:t>short_delta</w:t>
+            </w:r>
+            <w:r>
+              <w:rPr/>
+              <w:t xml:space="preserve">, </w:t>
+            </w:r>
+            <w:r>
+              <w:rPr>
+                <w:rFonts w:ascii="Consolas" w:hAnsi="Consolas"/>
+                <w:color w:val="334455"/>
+                <w:sz w:val="19"/>
+              </w:rPr>
+              <w:t>width</w:t>
+            </w:r>
+            <w:r>
+              <w:rPr/>
+              <w:t xml:space="preserve">, </w:t>
+            </w:r>
+            <w:r>
+              <w:rPr>
+                <w:rFonts w:ascii="Consolas" w:hAnsi="Consolas"/>
+                <w:color w:val="334455"/>
+                <w:sz w:val="19"/>
+              </w:rPr>
+              <w:t>expiry</w:t>
+            </w:r>
+            <w:r>
+              <w:rPr/>
+              <w:t xml:space="preserve">, </w:t>
+            </w:r>
+            <w:r>
+              <w:rPr>
+                <w:rFonts w:ascii="Consolas" w:hAnsi="Consolas"/>
+                <w:color w:val="334455"/>
+                <w:sz w:val="19"/>
+              </w:rPr>
+              <w:t>dte_after</w:t>
+            </w:r>
+            <w:r>
+              <w:rPr/>
+              <w:t xml:space="preserve">, </w:t>
+            </w:r>
+            <w:r>
+              <w:rPr>
+                <w:rFonts w:ascii="Consolas" w:hAnsi="Consolas"/>
+                <w:color w:val="334455"/>
+                <w:sz w:val="19"/>
+              </w:rPr>
+              <w:t>est_fill_legs[]</w:t>
+            </w:r>
+            <w:r>
+              <w:rPr/>
+              <w:t xml:space="preserve">, </w:t>
+            </w:r>
+            <w:r>
+              <w:rPr>
+                <w:rFonts w:ascii="Consolas" w:hAnsi="Consolas"/>
+                <w:color w:val="334455"/>
+                <w:sz w:val="19"/>
+              </w:rPr>
+              <w:t>rationale[]</w:t>
+            </w:r>
+            <w:r>
+              <w:rPr/>
+              <w:t xml:space="preserve">, </w:t>
+            </w:r>
+            <w:r>
+              <w:rPr>
+                <w:rFonts w:ascii="Consolas" w:hAnsi="Consolas"/>
+                <w:color w:val="334455"/>
+                <w:sz w:val="19"/>
+              </w:rPr>
+              <w:t>context[]</w:t>
+            </w:r>
+            <w:r>
+              <w:rPr/>
+              <w:t xml:space="preserve">, </w:t>
+            </w:r>
+            <w:r>
+              <w:rPr>
+                <w:rFonts w:ascii="Consolas" w:hAnsi="Consolas"/>
+                <w:color w:val="334455"/>
+                <w:sz w:val="19"/>
+              </w:rPr>
+              <w:t>warnings[]</w:t>
+            </w:r>
+            <w:r>
+              <w:rPr/>
+              <w:t xml:space="preserve">, </w:t>
+            </w:r>
+            <w:r>
+              <w:rPr>
+                <w:rFonts w:ascii="Consolas" w:hAnsi="Consolas"/>
+                <w:color w:val="334455"/>
+                <w:sz w:val="19"/>
+              </w:rPr>
+              <w:t>score</w:t>
+            </w:r>
+          </w:p>
+        </w:tc>
+      </w:tr>
     </w:tbl>
     <w:p/>
     <w:p>
@@ -4264,6 +4720,109 @@
           </w:p>
         </w:tc>
       </w:tr>
+      <w:tr>
+        <w:tc>
+          <w:tcPr>
+            <w:tcW w:type="dxa" w:w="2880"/>
+          </w:tcPr>
+          <w:p>
+            <w:r/>
+            <w:r>
+              <w:rPr>
+                <w:rFonts w:ascii="Consolas" w:hAnsi="Consolas"/>
+                <w:color w:val="334455"/>
+                <w:sz w:val="19"/>
+              </w:rPr>
+              <w:t>rescue</w:t>
+            </w:r>
+          </w:p>
+        </w:tc>
+        <w:tc>
+          <w:tcPr>
+            <w:tcW w:type="dxa" w:w="2880"/>
+          </w:tcPr>
+          <w:p>
+            <w:r/>
+            <w:r>
+              <w:rPr>
+                <w:rFonts w:ascii="Consolas" w:hAnsi="Consolas"/>
+                <w:color w:val="334455"/>
+                <w:sz w:val="19"/>
+              </w:rPr>
+              <w:t>{position_id}</w:t>
+            </w:r>
+          </w:p>
+        </w:tc>
+        <w:tc>
+          <w:tcPr>
+            <w:tcW w:type="dxa" w:w="2880"/>
+          </w:tcPr>
+          <w:p>
+            <w:r/>
+            <w:r>
+              <w:rPr>
+                <w:rFonts w:ascii="Consolas" w:hAnsi="Consolas"/>
+                <w:color w:val="334455"/>
+                <w:sz w:val="19"/>
+              </w:rPr>
+              <w:t>cache:options:rescue:&lt;position_id&gt;</w:t>
+            </w:r>
+          </w:p>
+        </w:tc>
+      </w:tr>
+      <w:tr>
+        <w:tc>
+          <w:tcPr>
+            <w:tcW w:type="dxa" w:w="2880"/>
+            <w:shd w:val="clear" w:color="auto" w:fill="F4F6FA"/>
+          </w:tcPr>
+          <w:p>
+            <w:r/>
+            <w:r>
+              <w:rPr>
+                <w:rFonts w:ascii="Consolas" w:hAnsi="Consolas"/>
+                <w:color w:val="334455"/>
+                <w:sz w:val="19"/>
+              </w:rPr>
+              <w:t>rescue_apply</w:t>
+            </w:r>
+          </w:p>
+        </w:tc>
+        <w:tc>
+          <w:tcPr>
+            <w:tcW w:type="dxa" w:w="2880"/>
+            <w:shd w:val="clear" w:color="auto" w:fill="F4F6FA"/>
+          </w:tcPr>
+          <w:p>
+            <w:r/>
+            <w:r>
+              <w:rPr>
+                <w:rFonts w:ascii="Consolas" w:hAnsi="Consolas"/>
+                <w:color w:val="334455"/>
+                <w:sz w:val="19"/>
+              </w:rPr>
+              <w:t>{position_id, candidate}</w:t>
+            </w:r>
+          </w:p>
+        </w:tc>
+        <w:tc>
+          <w:tcPr>
+            <w:tcW w:type="dxa" w:w="2880"/>
+            <w:shd w:val="clear" w:color="auto" w:fill="F4F6FA"/>
+          </w:tcPr>
+          <w:p>
+            <w:r/>
+            <w:r>
+              <w:rPr>
+                <w:rFonts w:ascii="Consolas" w:hAnsi="Consolas"/>
+                <w:color w:val="334455"/>
+                <w:sz w:val="19"/>
+              </w:rPr>
+              <w:t>cache:options:rescue:&lt;position_id&gt;</w:t>
+            </w:r>
+          </w:p>
+        </w:tc>
+      </w:tr>
     </w:tbl>
     <w:p/>
     <w:p>
@@ -4350,6 +4909,59 @@
       <w:r>
         <w:rPr/>
         <w:t xml:space="preserve"> (paper-manage window).</w:t>
+        <w:br/>
+        <w:t xml:space="preserve">The paper-manage cycle also overlays </w:t>
+      </w:r>
+      <w:r>
+        <w:rPr>
+          <w:rFonts w:ascii="Consolas" w:hAnsi="Consolas"/>
+          <w:color w:val="334455"/>
+          <w:sz w:val="19"/>
+        </w:rPr>
+        <w:t>rescue_state</w:t>
+      </w:r>
+      <w:r>
+        <w:rPr/>
+        <w:t xml:space="preserve"> / </w:t>
+      </w:r>
+      <w:r>
+        <w:rPr>
+          <w:rFonts w:ascii="Consolas" w:hAnsi="Consolas"/>
+          <w:color w:val="334455"/>
+          <w:sz w:val="19"/>
+        </w:rPr>
+        <w:t>heat</w:t>
+      </w:r>
+      <w:r>
+        <w:rPr/>
+        <w:t xml:space="preserve"> onto</w:t>
+        <w:br/>
+      </w:r>
+      <w:r>
+        <w:rPr>
+          <w:rFonts w:ascii="Consolas" w:hAnsi="Consolas"/>
+          <w:color w:val="334455"/>
+          <w:sz w:val="19"/>
+        </w:rPr>
+        <w:t>cache:options:paper_account</w:t>
+      </w:r>
+      <w:r>
+        <w:rPr/>
+        <w:t xml:space="preserve"> and publishes </w:t>
+      </w:r>
+      <w:r>
+        <w:rPr>
+          <w:rFonts w:ascii="Consolas" w:hAnsi="Consolas"/>
+          <w:color w:val="334455"/>
+          <w:sz w:val="19"/>
+        </w:rPr>
+        <w:t>cache:options:rescue_summary</w:t>
+      </w:r>
+      <w:r>
+        <w:rPr/>
+        <w:t xml:space="preserve"> (tested +</w:t>
+        <w:br/>
+        <w:t>critical counts) for the nav badge.</w:t>
       </w:r>
     </w:p>
     <w:p>
@@ -6751,6 +7363,28 @@
           <w:sz w:val="18"/>
         </w:rPr>
         <w:t>cache:options:expected_move    events:options:expected_move</w:t>
+      </w:r>
+      <w:r>
+        <w:br/>
+      </w:r>
+      <w:r>
+        <w:rPr>
+          <w:rFonts w:ascii="Consolas" w:hAnsi="Consolas"/>
+          <w:color w:val="223344"/>
+          <w:sz w:val="18"/>
+        </w:rPr>
+        <w:t>cache:options:rescue:&lt;position_id&gt;   events:options:rescue:&lt;position_id&gt;   (RescueAdvisory contract)</w:t>
+      </w:r>
+      <w:r>
+        <w:br/>
+      </w:r>
+      <w:r>
+        <w:rPr>
+          <w:rFonts w:ascii="Consolas" w:hAnsi="Consolas"/>
+          <w:color w:val="223344"/>
+          <w:sz w:val="18"/>
+        </w:rPr>
+        <w:t>cache:options:rescue_summary   events:options:rescue_summary</w:t>
       </w:r>
       <w:r>
         <w:br/>

</xml_diff>

<commit_message>
docs: document Markov 2.0 layout + feature in CLAUDE.md, manuals, ? popup
- CLAUDE.md: Markov card now the third equal-width frame in the verdict row.
- page_help.py: /trade ? popup gains a plain-language Markov Forecast bullet.
- Manuals (user/technical/api .md): Markov 2.0 documented — user-facing card,
  the band/matrix/shrinkage/projection/drift-tilt math, and the contract block
  + cache keys; rebuilt .html + .docx (build_docs.py date bumped).

Co-Authored-By: Claude Opus 4.8 <noreply@anthropic.com>
</commit_message>
<xml_diff>
--- a/docs/manuals/api-reference/api-reference.docx
+++ b/docs/manuals/api-reference/api-reference.docx
@@ -32,7 +32,7 @@
           <w:color w:val="5B6678"/>
           <w:sz w:val="18"/>
         </w:rPr>
-        <w:t>WebGUI Trading with Schwab · Generated 2026-06-21</w:t>
+        <w:t>WebGUI Trading with Schwab · Generated 2026-06-22</w:t>
       </w:r>
     </w:p>
     <w:p/>
@@ -1756,6 +1756,18 @@
                 <w:color w:val="334455"/>
                 <w:sz w:val="19"/>
               </w:rPr>
+              <w:t>markov{}</w:t>
+            </w:r>
+            <w:r>
+              <w:rPr/>
+              <w:t xml:space="preserve"> (optional), </w:t>
+            </w:r>
+            <w:r>
+              <w:rPr>
+                <w:rFonts w:ascii="Consolas" w:hAnsi="Consolas"/>
+                <w:color w:val="334455"/>
+                <w:sz w:val="19"/>
+              </w:rPr>
               <w:t>timestamp</w:t>
             </w:r>
             <w:r>
@@ -5403,7 +5415,17 @@
             <w:r/>
             <w:r>
               <w:rPr/>
-              <w:t xml:space="preserve">MTF technical + fundamental analysis → </w:t>
+              <w:t xml:space="preserve">MTF technical + fundamental analysis, plus the </w:t>
+            </w:r>
+            <w:r>
+              <w:rPr>
+                <w:b/>
+              </w:rPr>
+              <w:t>Markov 2.0</w:t>
+            </w:r>
+            <w:r>
+              <w:rPr/>
+              <w:t xml:space="preserve"> forecast (5-band composite-score chain → band-probability forecast + bounded drift tilt) → </w:t>
             </w:r>
             <w:r>
               <w:rPr>
@@ -5416,6 +5438,230 @@
             <w:r>
               <w:rPr/>
               <w:t>.</w:t>
+            </w:r>
+          </w:p>
+        </w:tc>
+      </w:tr>
+    </w:tbl>
+    <w:p/>
+    <w:p>
+      <w:r>
+        <w:rPr>
+          <w:b/>
+        </w:rPr>
+        <w:t>Published views:</w:t>
+      </w:r>
+    </w:p>
+    <w:tbl>
+      <w:tblPr>
+        <w:tblW w:type="auto" w:w="0"/>
+        <w:jc w:val="left"/>
+        <w:tblLayout w:type="autofit"/>
+        <w:tblLook w:firstColumn="1" w:firstRow="1" w:lastColumn="0" w:lastRow="0" w:noHBand="0" w:noVBand="1" w:val="04A0"/>
+        <w:tblBorders>
+          <w:top w:val="single" w:sz="4" w:space="0" w:color="D8DEE9"/>
+          <w:left w:val="single" w:sz="4" w:space="0" w:color="D8DEE9"/>
+          <w:bottom w:val="single" w:sz="4" w:space="0" w:color="D8DEE9"/>
+          <w:right w:val="single" w:sz="4" w:space="0" w:color="D8DEE9"/>
+          <w:insideH w:val="single" w:sz="4" w:space="0" w:color="D8DEE9"/>
+          <w:insideV w:val="single" w:sz="4" w:space="0" w:color="D8DEE9"/>
+        </w:tblBorders>
+      </w:tblPr>
+      <w:tblGrid>
+        <w:gridCol w:w="2880"/>
+        <w:gridCol w:w="2880"/>
+        <w:gridCol w:w="2880"/>
+      </w:tblGrid>
+      <w:tr>
+        <w:tc>
+          <w:tcPr>
+            <w:tcW w:type="dxa" w:w="2880"/>
+            <w:shd w:val="clear" w:color="auto" w:fill="EAF2FB"/>
+          </w:tcPr>
+          <w:p>
+            <w:r>
+              <w:rPr>
+                <w:b/>
+              </w:rPr>
+            </w:r>
+            <w:r>
+              <w:rPr>
+                <w:b/>
+              </w:rPr>
+              <w:t>Cache key</w:t>
+            </w:r>
+          </w:p>
+        </w:tc>
+        <w:tc>
+          <w:tcPr>
+            <w:tcW w:type="dxa" w:w="2880"/>
+            <w:shd w:val="clear" w:color="auto" w:fill="EAF2FB"/>
+          </w:tcPr>
+          <w:p>
+            <w:r>
+              <w:rPr>
+                <w:b/>
+              </w:rPr>
+            </w:r>
+            <w:r>
+              <w:rPr>
+                <w:b/>
+              </w:rPr>
+              <w:t>Event</w:t>
+            </w:r>
+          </w:p>
+        </w:tc>
+        <w:tc>
+          <w:tcPr>
+            <w:tcW w:type="dxa" w:w="2880"/>
+            <w:shd w:val="clear" w:color="auto" w:fill="EAF2FB"/>
+          </w:tcPr>
+          <w:p>
+            <w:r>
+              <w:rPr>
+                <w:b/>
+              </w:rPr>
+            </w:r>
+            <w:r>
+              <w:rPr>
+                <w:b/>
+              </w:rPr>
+              <w:t>Payload</w:t>
+            </w:r>
+          </w:p>
+        </w:tc>
+      </w:tr>
+      <w:tr>
+        <w:tc>
+          <w:tcPr>
+            <w:tcW w:type="dxa" w:w="2880"/>
+          </w:tcPr>
+          <w:p>
+            <w:r/>
+            <w:r>
+              <w:rPr>
+                <w:rFonts w:ascii="Consolas" w:hAnsi="Consolas"/>
+                <w:color w:val="334455"/>
+                <w:sz w:val="19"/>
+              </w:rPr>
+              <w:t>cache:trade:analysis</w:t>
+            </w:r>
+          </w:p>
+        </w:tc>
+        <w:tc>
+          <w:tcPr>
+            <w:tcW w:type="dxa" w:w="2880"/>
+          </w:tcPr>
+          <w:p>
+            <w:r/>
+            <w:r>
+              <w:rPr>
+                <w:rFonts w:ascii="Consolas" w:hAnsi="Consolas"/>
+                <w:color w:val="334455"/>
+                <w:sz w:val="19"/>
+              </w:rPr>
+              <w:t>events:trade:analysis</w:t>
+            </w:r>
+          </w:p>
+        </w:tc>
+        <w:tc>
+          <w:tcPr>
+            <w:tcW w:type="dxa" w:w="2880"/>
+          </w:tcPr>
+          <w:p>
+            <w:r/>
+            <w:r>
+              <w:rPr>
+                <w:rFonts w:ascii="Consolas" w:hAnsi="Consolas"/>
+                <w:color w:val="334455"/>
+                <w:sz w:val="19"/>
+              </w:rPr>
+              <w:t>TradeAnalysis</w:t>
+            </w:r>
+            <w:r>
+              <w:rPr/>
+              <w:t xml:space="preserve"> — verdicts + momentum + sector + fundamentals + the optional </w:t>
+            </w:r>
+            <w:r>
+              <w:rPr>
+                <w:rFonts w:ascii="Consolas" w:hAnsi="Consolas"/>
+                <w:color w:val="334455"/>
+                <w:sz w:val="19"/>
+              </w:rPr>
+              <w:t>markov</w:t>
+            </w:r>
+            <w:r>
+              <w:rPr/>
+              <w:t xml:space="preserve"> forecast block.</w:t>
+            </w:r>
+          </w:p>
+        </w:tc>
+      </w:tr>
+      <w:tr>
+        <w:tc>
+          <w:tcPr>
+            <w:tcW w:type="dxa" w:w="2880"/>
+            <w:shd w:val="clear" w:color="auto" w:fill="F4F6FA"/>
+          </w:tcPr>
+          <w:p>
+            <w:r/>
+            <w:r>
+              <w:rPr>
+                <w:rFonts w:ascii="Consolas" w:hAnsi="Consolas"/>
+                <w:color w:val="334455"/>
+                <w:sz w:val="19"/>
+              </w:rPr>
+              <w:t>cache:trade:markov_prior</w:t>
+            </w:r>
+          </w:p>
+        </w:tc>
+        <w:tc>
+          <w:tcPr>
+            <w:tcW w:type="dxa" w:w="2880"/>
+            <w:shd w:val="clear" w:color="auto" w:fill="F4F6FA"/>
+          </w:tcPr>
+          <w:p>
+            <w:r/>
+            <w:r>
+              <w:rPr/>
+              <w:t>—</w:t>
+            </w:r>
+          </w:p>
+        </w:tc>
+        <w:tc>
+          <w:tcPr>
+            <w:tcW w:type="dxa" w:w="2880"/>
+            <w:shd w:val="clear" w:color="auto" w:fill="F4F6FA"/>
+          </w:tcPr>
+          <w:p>
+            <w:r/>
+            <w:r>
+              <w:rPr/>
+              <w:t xml:space="preserve">Pooled Markov transition prior </w:t>
+            </w:r>
+            <w:r>
+              <w:rPr>
+                <w:rFonts w:ascii="Consolas" w:hAnsi="Consolas"/>
+                <w:color w:val="334455"/>
+                <w:sz w:val="19"/>
+              </w:rPr>
+              <w:t>{matrix[5][5], date, n_symbols}</w:t>
+            </w:r>
+            <w:r>
+              <w:rPr/>
+              <w:t xml:space="preserve">; rebuilt lazily once/day and read by </w:t>
+            </w:r>
+            <w:r>
+              <w:rPr>
+                <w:rFonts w:ascii="Consolas" w:hAnsi="Consolas"/>
+                <w:color w:val="334455"/>
+                <w:sz w:val="19"/>
+              </w:rPr>
+              <w:t>analyze</w:t>
+            </w:r>
+            <w:r>
+              <w:rPr/>
+              <w:t xml:space="preserve"> (internal memoization — no event).</w:t>
             </w:r>
           </w:p>
         </w:tc>

</xml_diff>

<commit_message>
docs(manuals): multi-leg Simulator + Calculator in user/tech/api guides + page help
- User Guide: Calculator + Simulator sections rewritten for the strategy
  templates, editable leg editor (per-leg expiry/qty), generic numeric summary,
  and the Copy-legs buttons both ways.
- Technical Reference: calc_summary_generic + calc_spread_pnl(per_leg_expiry)
  + Leg.ratio/Position.from_legs + per-leg elapsed What-if decay.
- API Reference: sim_run/sim_replay take legs[]; calc_compute per-leg expiry.
- page_help.py: Calculator + Simulator quick-help updated (Simulator no longer
  says "one contract").
- Regenerated .html + .docx (build date 2026-06-23).

Co-Authored-By: Claude Opus 4.8 <noreply@anthropic.com>
</commit_message>
<xml_diff>
--- a/docs/manuals/api-reference/api-reference.docx
+++ b/docs/manuals/api-reference/api-reference.docx
@@ -32,7 +32,7 @@
           <w:color w:val="5B6678"/>
           <w:sz w:val="18"/>
         </w:rPr>
-        <w:t>WebGUI Trading with Schwab · Generated 2026-06-22</w:t>
+        <w:t>WebGUI Trading with Schwab · Generated 2026-06-23</w:t>
       </w:r>
     </w:p>
     <w:p/>
@@ -4504,7 +4504,35 @@
                 <w:color w:val="334455"/>
                 <w:sz w:val="19"/>
               </w:rPr>
-              <w:t>{symbol, expiry, kind, strike, direction, dt, mult}</w:t>
+              <w:t>{symbol, legs[], dt, mult}</w:t>
+            </w:r>
+            <w:r>
+              <w:rPr/>
+              <w:t xml:space="preserve"> (legs: </w:t>
+            </w:r>
+            <w:r>
+              <w:rPr>
+                <w:rFonts w:ascii="Consolas" w:hAnsi="Consolas"/>
+                <w:color w:val="334455"/>
+                <w:sz w:val="19"/>
+              </w:rPr>
+              <w:t>{kind, strike, expiry, side, qty}</w:t>
+            </w:r>
+            <w:r>
+              <w:rPr/>
+              <w:t xml:space="preserve">; legacy </w:t>
+            </w:r>
+            <w:r>
+              <w:rPr>
+                <w:rFonts w:ascii="Consolas" w:hAnsi="Consolas"/>
+                <w:color w:val="334455"/>
+                <w:sz w:val="19"/>
+              </w:rPr>
+              <w:t>{expiry, kind, strike, direction}</w:t>
+            </w:r>
+            <w:r>
+              <w:rPr/>
+              <w:t xml:space="preserve"> single-leg args still accepted)</w:t>
             </w:r>
           </w:p>
         </w:tc>
@@ -4555,7 +4583,11 @@
                 <w:color w:val="334455"/>
                 <w:sz w:val="19"/>
               </w:rPr>
-              <w:t>{symbol, expiry, kind, strike, direction, lookback}</w:t>
+              <w:t>{symbol, legs[], lookback}</w:t>
+            </w:r>
+            <w:r>
+              <w:rPr/>
+              <w:t xml:space="preserve"> (same multi-leg shape; legacy single-leg args still accepted)</w:t>
             </w:r>
           </w:p>
         </w:tc>
@@ -4658,7 +4690,47 @@
                 <w:color w:val="334455"/>
                 <w:sz w:val="19"/>
               </w:rPr>
-              <w:t>{...calc params}</w:t>
+              <w:t>{strategy, spot, iv, rate, ivadj, qty, expiry, legs[], range_*}</w:t>
+            </w:r>
+            <w:r>
+              <w:rPr/>
+              <w:t xml:space="preserve"> (each leg carries its own </w:t>
+            </w:r>
+            <w:r>
+              <w:rPr>
+                <w:rFonts w:ascii="Consolas" w:hAnsi="Consolas"/>
+                <w:color w:val="334455"/>
+                <w:sz w:val="19"/>
+              </w:rPr>
+              <w:t>expiry</w:t>
+            </w:r>
+            <w:r>
+              <w:rPr/>
+              <w:t>/</w:t>
+            </w:r>
+            <w:r>
+              <w:rPr>
+                <w:rFonts w:ascii="Consolas" w:hAnsi="Consolas"/>
+                <w:color w:val="334455"/>
+                <w:sz w:val="19"/>
+              </w:rPr>
+              <w:t>qty</w:t>
+            </w:r>
+            <w:r>
+              <w:rPr/>
+              <w:t xml:space="preserve">; </w:t>
+            </w:r>
+            <w:r>
+              <w:rPr>
+                <w:rFonts w:ascii="Consolas" w:hAnsi="Consolas"/>
+                <w:color w:val="334455"/>
+                <w:sz w:val="19"/>
+              </w:rPr>
+              <w:t>strategy="CUSTOM"</w:t>
+            </w:r>
+            <w:r>
+              <w:rPr/>
+              <w:t xml:space="preserve"> or any non-PCS/CCS/IC/single code → generic numeric summary)</w:t>
             </w:r>
           </w:p>
         </w:tc>

</xml_diff>

<commit_message>
docs: validated swing evaluation — CLAUDE.md, manuals, ? popup
Co-Authored-By: Claude Opus 4.8 <noreply@anthropic.com>
</commit_message>
<xml_diff>
--- a/docs/manuals/api-reference/api-reference.docx
+++ b/docs/manuals/api-reference/api-reference.docx
@@ -32,7 +32,7 @@
           <w:color w:val="5B6678"/>
           <w:sz w:val="18"/>
         </w:rPr>
-        <w:t>WebGUI Trading with Schwab · Generated 2026-06-23</w:t>
+        <w:t>WebGUI Trading with Schwab · Generated 2026-06-28</w:t>
       </w:r>
     </w:p>
     <w:p/>
@@ -1768,6 +1768,18 @@
                 <w:color w:val="334455"/>
                 <w:sz w:val="19"/>
               </w:rPr>
+              <w:t>swing_model{}</w:t>
+            </w:r>
+            <w:r>
+              <w:rPr/>
+              <w:t xml:space="preserve"> (optional), </w:t>
+            </w:r>
+            <w:r>
+              <w:rPr>
+                <w:rFonts w:ascii="Consolas" w:hAnsi="Consolas"/>
+                <w:color w:val="334455"/>
+                <w:sz w:val="19"/>
+              </w:rPr>
               <w:t>timestamp</w:t>
             </w:r>
             <w:r>
@@ -5493,11 +5505,21 @@
               <w:rPr>
                 <w:b/>
               </w:rPr>
+              <w:t>validated swing model</w:t>
+            </w:r>
+            <w:r>
+              <w:rPr/>
+              <w:t xml:space="preserve"> verdict (Position), the </w:t>
+            </w:r>
+            <w:r>
+              <w:rPr>
+                <w:b/>
+              </w:rPr>
               <w:t>Markov 2.0</w:t>
             </w:r>
             <w:r>
               <w:rPr/>
-              <w:t xml:space="preserve"> forecast (5-band composite-score chain → band-probability forecast + bounded drift tilt) → </w:t>
+              <w:t xml:space="preserve"> forecast (5-band composite-score chain → band-probability forecast + bounded drift tilt), and the Investor verdict → </w:t>
             </w:r>
             <w:r>
               <w:rPr>
@@ -5664,7 +5686,19 @@
             </w:r>
             <w:r>
               <w:rPr/>
-              <w:t xml:space="preserve"> forecast block.</w:t>
+              <w:t xml:space="preserve"> forecast block + the optional </w:t>
+            </w:r>
+            <w:r>
+              <w:rPr>
+                <w:rFonts w:ascii="Consolas" w:hAnsi="Consolas"/>
+                <w:color w:val="334455"/>
+                <w:sz w:val="19"/>
+              </w:rPr>
+              <w:t>swing_model</w:t>
+            </w:r>
+            <w:r>
+              <w:rPr/>
+              <w:t xml:space="preserve"> block.</w:t>
             </w:r>
           </w:p>
         </w:tc>
@@ -5738,8 +5772,854 @@
           </w:p>
         </w:tc>
       </w:tr>
+      <w:tr>
+        <w:tc>
+          <w:tcPr>
+            <w:tcW w:type="dxa" w:w="2880"/>
+          </w:tcPr>
+          <w:p>
+            <w:r/>
+            <w:r>
+              <w:rPr>
+                <w:rFonts w:ascii="Consolas" w:hAnsi="Consolas"/>
+                <w:color w:val="334455"/>
+                <w:sz w:val="19"/>
+              </w:rPr>
+              <w:t>cache:trade:universe_factors</w:t>
+            </w:r>
+          </w:p>
+        </w:tc>
+        <w:tc>
+          <w:tcPr>
+            <w:tcW w:type="dxa" w:w="2880"/>
+          </w:tcPr>
+          <w:p>
+            <w:r/>
+            <w:r>
+              <w:rPr/>
+              <w:t>—</w:t>
+            </w:r>
+          </w:p>
+        </w:tc>
+        <w:tc>
+          <w:tcPr>
+            <w:tcW w:type="dxa" w:w="2880"/>
+          </w:tcPr>
+          <w:p>
+            <w:r/>
+            <w:r>
+              <w:rPr/>
+              <w:t xml:space="preserve">Daily swing-model factor snapshot </w:t>
+            </w:r>
+            <w:r>
+              <w:rPr>
+                <w:rFonts w:ascii="Consolas" w:hAnsi="Consolas"/>
+                <w:color w:val="334455"/>
+                <w:sz w:val="19"/>
+              </w:rPr>
+              <w:t>{factors{factor: [values]}, date}</w:t>
+            </w:r>
+            <w:r>
+              <w:rPr/>
+              <w:t xml:space="preserve"> across a curated universe; rebuilt lazily once/day and read by </w:t>
+            </w:r>
+            <w:r>
+              <w:rPr>
+                <w:rFonts w:ascii="Consolas" w:hAnsi="Consolas"/>
+                <w:color w:val="334455"/>
+                <w:sz w:val="19"/>
+              </w:rPr>
+              <w:t>analyze</w:t>
+            </w:r>
+            <w:r>
+              <w:rPr/>
+              <w:t xml:space="preserve"> as the </w:t>
+            </w:r>
+            <w:r>
+              <w:rPr>
+                <w:b/>
+              </w:rPr>
+              <w:t>secondary</w:t>
+            </w:r>
+            <w:r>
+              <w:rPr/>
+              <w:t xml:space="preserve"> cross-sectional fallback basis (the artifact's </w:t>
+            </w:r>
+            <w:r>
+              <w:rPr>
+                <w:rFonts w:ascii="Consolas" w:hAnsi="Consolas"/>
+                <w:color w:val="334455"/>
+                <w:sz w:val="19"/>
+              </w:rPr>
+              <w:t>norm</w:t>
+            </w:r>
+            <w:r>
+              <w:rPr/>
+              <w:t xml:space="preserve"> is primary). No event.</w:t>
+            </w:r>
+          </w:p>
+        </w:tc>
+      </w:tr>
     </w:tbl>
     <w:p/>
+    <w:p>
+      <w:r>
+        <w:rPr>
+          <w:rFonts w:ascii="Consolas" w:hAnsi="Consolas"/>
+          <w:color w:val="334455"/>
+          <w:sz w:val="19"/>
+        </w:rPr>
+        <w:t>swing_model</w:t>
+      </w:r>
+      <w:r>
+        <w:rPr>
+          <w:b/>
+        </w:rPr>
+        <w:t xml:space="preserve"> block</w:t>
+      </w:r>
+      <w:r>
+        <w:rPr/>
+        <w:t xml:space="preserve"> (additive, optional — present when the artifact loaded and the</w:t>
+        <w:br/>
+        <w:t>symbol scored; absent → the page shows the legacy verdict). Produced by</w:t>
+        <w:br/>
+      </w:r>
+      <w:r>
+        <w:rPr>
+          <w:rFonts w:ascii="Consolas" w:hAnsi="Consolas"/>
+          <w:color w:val="334455"/>
+          <w:sz w:val="19"/>
+        </w:rPr>
+        <w:t>services/trade_svc/swing_model.py:score_symbol</w:t>
+      </w:r>
+      <w:r>
+        <w:rPr/>
+        <w:t>:</w:t>
+      </w:r>
+    </w:p>
+    <w:tbl>
+      <w:tblPr>
+        <w:tblW w:type="auto" w:w="0"/>
+        <w:jc w:val="left"/>
+        <w:tblLayout w:type="autofit"/>
+        <w:tblLook w:firstColumn="1" w:firstRow="1" w:lastColumn="0" w:lastRow="0" w:noHBand="0" w:noVBand="1" w:val="04A0"/>
+        <w:tblBorders>
+          <w:top w:val="single" w:sz="4" w:space="0" w:color="D8DEE9"/>
+          <w:left w:val="single" w:sz="4" w:space="0" w:color="D8DEE9"/>
+          <w:bottom w:val="single" w:sz="4" w:space="0" w:color="D8DEE9"/>
+          <w:right w:val="single" w:sz="4" w:space="0" w:color="D8DEE9"/>
+          <w:insideH w:val="single" w:sz="4" w:space="0" w:color="D8DEE9"/>
+          <w:insideV w:val="single" w:sz="4" w:space="0" w:color="D8DEE9"/>
+        </w:tblBorders>
+      </w:tblPr>
+      <w:tblGrid>
+        <w:gridCol w:w="4320"/>
+        <w:gridCol w:w="4320"/>
+      </w:tblGrid>
+      <w:tr>
+        <w:tc>
+          <w:tcPr>
+            <w:tcW w:type="dxa" w:w="4320"/>
+            <w:shd w:val="clear" w:color="auto" w:fill="EAF2FB"/>
+          </w:tcPr>
+          <w:p>
+            <w:r>
+              <w:rPr>
+                <w:b/>
+              </w:rPr>
+            </w:r>
+            <w:r>
+              <w:rPr>
+                <w:b/>
+              </w:rPr>
+              <w:t>Field</w:t>
+            </w:r>
+          </w:p>
+        </w:tc>
+        <w:tc>
+          <w:tcPr>
+            <w:tcW w:type="dxa" w:w="4320"/>
+            <w:shd w:val="clear" w:color="auto" w:fill="EAF2FB"/>
+          </w:tcPr>
+          <w:p>
+            <w:r>
+              <w:rPr>
+                <w:b/>
+              </w:rPr>
+            </w:r>
+            <w:r>
+              <w:rPr>
+                <w:b/>
+              </w:rPr>
+              <w:t>Meaning</w:t>
+            </w:r>
+          </w:p>
+        </w:tc>
+      </w:tr>
+      <w:tr>
+        <w:tc>
+          <w:tcPr>
+            <w:tcW w:type="dxa" w:w="4320"/>
+          </w:tcPr>
+          <w:p>
+            <w:r/>
+            <w:r>
+              <w:rPr>
+                <w:rFonts w:ascii="Consolas" w:hAnsi="Consolas"/>
+                <w:color w:val="334455"/>
+                <w:sz w:val="19"/>
+              </w:rPr>
+              <w:t>verdict</w:t>
+            </w:r>
+          </w:p>
+        </w:tc>
+        <w:tc>
+          <w:tcPr>
+            <w:tcW w:type="dxa" w:w="4320"/>
+          </w:tcPr>
+          <w:p>
+            <w:r/>
+            <w:r>
+              <w:rPr>
+                <w:rFonts w:ascii="Consolas" w:hAnsi="Consolas"/>
+                <w:color w:val="334455"/>
+                <w:sz w:val="19"/>
+              </w:rPr>
+              <w:t>BUY</w:t>
+            </w:r>
+            <w:r>
+              <w:rPr/>
+              <w:t xml:space="preserve"> (top calibration band) / </w:t>
+            </w:r>
+            <w:r>
+              <w:rPr>
+                <w:rFonts w:ascii="Consolas" w:hAnsi="Consolas"/>
+                <w:color w:val="334455"/>
+                <w:sz w:val="19"/>
+              </w:rPr>
+              <w:t>SELL</w:t>
+            </w:r>
+            <w:r>
+              <w:rPr/>
+              <w:t xml:space="preserve"> (bottom) / </w:t>
+            </w:r>
+            <w:r>
+              <w:rPr>
+                <w:rFonts w:ascii="Consolas" w:hAnsi="Consolas"/>
+                <w:color w:val="334455"/>
+                <w:sz w:val="19"/>
+              </w:rPr>
+              <w:t>HOLD</w:t>
+            </w:r>
+            <w:r>
+              <w:rPr/>
+              <w:t>.</w:t>
+            </w:r>
+          </w:p>
+        </w:tc>
+      </w:tr>
+      <w:tr>
+        <w:tc>
+          <w:tcPr>
+            <w:tcW w:type="dxa" w:w="4320"/>
+            <w:shd w:val="clear" w:color="auto" w:fill="F4F6FA"/>
+          </w:tcPr>
+          <w:p>
+            <w:r/>
+            <w:r>
+              <w:rPr>
+                <w:rFonts w:ascii="Consolas" w:hAnsi="Consolas"/>
+                <w:color w:val="334455"/>
+                <w:sz w:val="19"/>
+              </w:rPr>
+              <w:t>score</w:t>
+            </w:r>
+          </w:p>
+        </w:tc>
+        <w:tc>
+          <w:tcPr>
+            <w:tcW w:type="dxa" w:w="4320"/>
+            <w:shd w:val="clear" w:color="auto" w:fill="F4F6FA"/>
+          </w:tcPr>
+          <w:p>
+            <w:r/>
+            <w:r>
+              <w:rPr/>
+              <w:t>The signed-IC-weighted composite (</w:t>
+            </w:r>
+            <w:r>
+              <w:rPr>
+                <w:rFonts w:ascii="Consolas" w:hAnsi="Consolas"/>
+                <w:color w:val="334455"/>
+                <w:sz w:val="19"/>
+              </w:rPr>
+              <w:t>Σ signed_weight · clip(z, ±3)</w:t>
+            </w:r>
+            <w:r>
+              <w:rPr/>
+              <w:t>).</w:t>
+            </w:r>
+          </w:p>
+        </w:tc>
+      </w:tr>
+      <w:tr>
+        <w:tc>
+          <w:tcPr>
+            <w:tcW w:type="dxa" w:w="4320"/>
+          </w:tcPr>
+          <w:p>
+            <w:r/>
+            <w:r>
+              <w:rPr>
+                <w:rFonts w:ascii="Consolas" w:hAnsi="Consolas"/>
+                <w:color w:val="334455"/>
+                <w:sz w:val="19"/>
+              </w:rPr>
+              <w:t>percentile</w:t>
+            </w:r>
+          </w:p>
+        </w:tc>
+        <w:tc>
+          <w:tcPr>
+            <w:tcW w:type="dxa" w:w="4320"/>
+          </w:tcPr>
+          <w:p>
+            <w:r/>
+            <w:r>
+              <w:rPr/>
+              <w:t>Band-quantile percentile (top band of 5 → ~90th).</w:t>
+            </w:r>
+          </w:p>
+        </w:tc>
+      </w:tr>
+      <w:tr>
+        <w:tc>
+          <w:tcPr>
+            <w:tcW w:type="dxa" w:w="4320"/>
+            <w:shd w:val="clear" w:color="auto" w:fill="F4F6FA"/>
+          </w:tcPr>
+          <w:p>
+            <w:r/>
+            <w:r>
+              <w:rPr>
+                <w:rFonts w:ascii="Consolas" w:hAnsi="Consolas"/>
+                <w:color w:val="334455"/>
+                <w:sz w:val="19"/>
+              </w:rPr>
+              <w:t>expected_fwd</w:t>
+            </w:r>
+          </w:p>
+        </w:tc>
+        <w:tc>
+          <w:tcPr>
+            <w:tcW w:type="dxa" w:w="4320"/>
+            <w:shd w:val="clear" w:color="auto" w:fill="F4F6FA"/>
+          </w:tcPr>
+          <w:p>
+            <w:r/>
+            <w:r>
+              <w:rPr/>
+              <w:t>The band's mean forward excess return over the horizon.</w:t>
+            </w:r>
+          </w:p>
+        </w:tc>
+      </w:tr>
+      <w:tr>
+        <w:tc>
+          <w:tcPr>
+            <w:tcW w:type="dxa" w:w="4320"/>
+          </w:tcPr>
+          <w:p>
+            <w:r/>
+            <w:r>
+              <w:rPr>
+                <w:rFonts w:ascii="Consolas" w:hAnsi="Consolas"/>
+                <w:color w:val="334455"/>
+                <w:sz w:val="19"/>
+              </w:rPr>
+              <w:t>hit_rate</w:t>
+            </w:r>
+          </w:p>
+        </w:tc>
+        <w:tc>
+          <w:tcPr>
+            <w:tcW w:type="dxa" w:w="4320"/>
+          </w:tcPr>
+          <w:p>
+            <w:r/>
+            <w:r>
+              <w:rPr/>
+              <w:t>The band's beat-SPY hit-rate (</w:t>
+            </w:r>
+            <w:r>
+              <w:rPr>
+                <w:rFonts w:ascii="Consolas" w:hAnsi="Consolas"/>
+                <w:color w:val="334455"/>
+                <w:sz w:val="19"/>
+              </w:rPr>
+              <w:t>P(forward &gt; 0)</w:t>
+            </w:r>
+            <w:r>
+              <w:rPr/>
+              <w:t>).</w:t>
+            </w:r>
+          </w:p>
+        </w:tc>
+      </w:tr>
+      <w:tr>
+        <w:tc>
+          <w:tcPr>
+            <w:tcW w:type="dxa" w:w="4320"/>
+            <w:shd w:val="clear" w:color="auto" w:fill="F4F6FA"/>
+          </w:tcPr>
+          <w:p>
+            <w:r/>
+            <w:r>
+              <w:rPr>
+                <w:rFonts w:ascii="Consolas" w:hAnsi="Consolas"/>
+                <w:color w:val="334455"/>
+                <w:sz w:val="19"/>
+              </w:rPr>
+              <w:t>horizon_days</w:t>
+            </w:r>
+          </w:p>
+        </w:tc>
+        <w:tc>
+          <w:tcPr>
+            <w:tcW w:type="dxa" w:w="4320"/>
+            <w:shd w:val="clear" w:color="auto" w:fill="F4F6FA"/>
+          </w:tcPr>
+          <w:p>
+            <w:r/>
+            <w:r>
+              <w:rPr/>
+              <w:t>The label horizon (20).</w:t>
+            </w:r>
+          </w:p>
+        </w:tc>
+      </w:tr>
+      <w:tr>
+        <w:tc>
+          <w:tcPr>
+            <w:tcW w:type="dxa" w:w="4320"/>
+          </w:tcPr>
+          <w:p>
+            <w:r/>
+            <w:r>
+              <w:rPr>
+                <w:rFonts w:ascii="Consolas" w:hAnsi="Consolas"/>
+                <w:color w:val="334455"/>
+                <w:sz w:val="19"/>
+              </w:rPr>
+              <w:t>contributions[]</w:t>
+            </w:r>
+          </w:p>
+        </w:tc>
+        <w:tc>
+          <w:tcPr>
+            <w:tcW w:type="dxa" w:w="4320"/>
+          </w:tcPr>
+          <w:p>
+            <w:r/>
+            <w:r>
+              <w:rPr/>
+              <w:t xml:space="preserve">Per factor </w:t>
+            </w:r>
+            <w:r>
+              <w:rPr>
+                <w:rFonts w:ascii="Consolas" w:hAnsi="Consolas"/>
+                <w:color w:val="334455"/>
+                <w:sz w:val="19"/>
+              </w:rPr>
+              <w:t>{factor, z, weight, contribution, ic}</w:t>
+            </w:r>
+            <w:r>
+              <w:rPr/>
+              <w:t>, sorted by |contribution|.</w:t>
+            </w:r>
+          </w:p>
+        </w:tc>
+      </w:tr>
+      <w:tr>
+        <w:tc>
+          <w:tcPr>
+            <w:tcW w:type="dxa" w:w="4320"/>
+            <w:shd w:val="clear" w:color="auto" w:fill="F4F6FA"/>
+          </w:tcPr>
+          <w:p>
+            <w:r/>
+            <w:r>
+              <w:rPr>
+                <w:rFonts w:ascii="Consolas" w:hAnsi="Consolas"/>
+                <w:color w:val="334455"/>
+                <w:sz w:val="19"/>
+              </w:rPr>
+              <w:t>model_version</w:t>
+            </w:r>
+          </w:p>
+        </w:tc>
+        <w:tc>
+          <w:tcPr>
+            <w:tcW w:type="dxa" w:w="4320"/>
+            <w:shd w:val="clear" w:color="auto" w:fill="F4F6FA"/>
+          </w:tcPr>
+          <w:p>
+            <w:r/>
+            <w:r>
+              <w:rPr/>
+              <w:t xml:space="preserve">The artifact's </w:t>
+            </w:r>
+            <w:r>
+              <w:rPr>
+                <w:rFonts w:ascii="Consolas" w:hAnsi="Consolas"/>
+                <w:color w:val="334455"/>
+                <w:sz w:val="19"/>
+              </w:rPr>
+              <w:t>version</w:t>
+            </w:r>
+            <w:r>
+              <w:rPr/>
+              <w:t xml:space="preserve"> (fit date).</w:t>
+            </w:r>
+          </w:p>
+        </w:tc>
+      </w:tr>
+      <w:tr>
+        <w:tc>
+          <w:tcPr>
+            <w:tcW w:type="dxa" w:w="4320"/>
+          </w:tcPr>
+          <w:p>
+            <w:r/>
+            <w:r>
+              <w:rPr>
+                <w:rFonts w:ascii="Consolas" w:hAnsi="Consolas"/>
+                <w:color w:val="334455"/>
+                <w:sz w:val="19"/>
+              </w:rPr>
+              <w:t>oos_ic</w:t>
+            </w:r>
+          </w:p>
+        </w:tc>
+        <w:tc>
+          <w:tcPr>
+            <w:tcW w:type="dxa" w:w="4320"/>
+          </w:tcPr>
+          <w:p>
+            <w:r/>
+            <w:r>
+              <w:rPr/>
+              <w:t>The artifact's walk-forward out-of-sample IC.</w:t>
+            </w:r>
+          </w:p>
+        </w:tc>
+      </w:tr>
+      <w:tr>
+        <w:tc>
+          <w:tcPr>
+            <w:tcW w:type="dxa" w:w="4320"/>
+            <w:shd w:val="clear" w:color="auto" w:fill="F4F6FA"/>
+          </w:tcPr>
+          <w:p>
+            <w:r/>
+            <w:r>
+              <w:rPr>
+                <w:rFonts w:ascii="Consolas" w:hAnsi="Consolas"/>
+                <w:color w:val="334455"/>
+                <w:sz w:val="19"/>
+              </w:rPr>
+              <w:t>source</w:t>
+            </w:r>
+          </w:p>
+        </w:tc>
+        <w:tc>
+          <w:tcPr>
+            <w:tcW w:type="dxa" w:w="4320"/>
+            <w:shd w:val="clear" w:color="auto" w:fill="F4F6FA"/>
+          </w:tcPr>
+          <w:p>
+            <w:r/>
+            <w:r>
+              <w:rPr>
+                <w:rFonts w:ascii="Consolas" w:hAnsi="Consolas"/>
+                <w:color w:val="334455"/>
+                <w:sz w:val="19"/>
+              </w:rPr>
+              <w:t>"validated"</w:t>
+            </w:r>
+            <w:r>
+              <w:rPr/>
+              <w:t>.</w:t>
+            </w:r>
+          </w:p>
+        </w:tc>
+      </w:tr>
+    </w:tbl>
+    <w:p/>
+    <w:p>
+      <w:r>
+        <w:rPr>
+          <w:b/>
+        </w:rPr>
+        <w:t>Offline artifact (not a service view).</w:t>
+      </w:r>
+      <w:r>
+        <w:rPr/>
+        <w:t xml:space="preserve"> </w:t>
+      </w:r>
+      <w:r>
+        <w:rPr>
+          <w:rFonts w:ascii="Consolas" w:hAnsi="Consolas"/>
+          <w:color w:val="334455"/>
+          <w:sz w:val="19"/>
+        </w:rPr>
+        <w:t>trade-analyzer/data/swing_model.json</w:t>
+      </w:r>
+      <w:r>
+        <w:rPr/>
+        <w:br/>
+        <w:t>(</w:t>
+      </w:r>
+      <w:r>
+        <w:rPr>
+          <w:rFonts w:ascii="Consolas" w:hAnsi="Consolas"/>
+          <w:color w:val="334455"/>
+          <w:sz w:val="19"/>
+        </w:rPr>
+        <w:t>repo_paths.SWING_MODEL</w:t>
+      </w:r>
+      <w:r>
+        <w:rPr/>
+        <w:t xml:space="preserve">, gitignored) is fit </w:t>
+      </w:r>
+      <w:r>
+        <w:rPr>
+          <w:b/>
+        </w:rPr>
+        <w:t>offline</w:t>
+      </w:r>
+      <w:r>
+        <w:rPr/>
+        <w:t xml:space="preserve"> by</w:t>
+        <w:br/>
+      </w:r>
+      <w:r>
+        <w:rPr>
+          <w:rFonts w:ascii="Consolas" w:hAnsi="Consolas"/>
+          <w:color w:val="334455"/>
+          <w:sz w:val="19"/>
+        </w:rPr>
+        <w:t>trade-analyzer/fit_swing_model.py</w:t>
+      </w:r>
+      <w:r>
+        <w:rPr/>
+        <w:t xml:space="preserve"> (run manually/periodically — never imported by a</w:t>
+        <w:br/>
+        <w:t xml:space="preserve">service) using the pure </w:t>
+      </w:r>
+      <w:r>
+        <w:rPr>
+          <w:rFonts w:ascii="Consolas" w:hAnsi="Consolas"/>
+          <w:color w:val="334455"/>
+          <w:sz w:val="19"/>
+        </w:rPr>
+        <w:t>src/analysis/factors.py</w:t>
+      </w:r>
+      <w:r>
+        <w:rPr/>
+        <w:t xml:space="preserve"> + </w:t>
+      </w:r>
+      <w:r>
+        <w:rPr>
+          <w:rFonts w:ascii="Consolas" w:hAnsi="Consolas"/>
+          <w:color w:val="334455"/>
+          <w:sz w:val="19"/>
+        </w:rPr>
+        <w:t>src/analysis/backtest.py</w:t>
+      </w:r>
+      <w:r>
+        <w:rPr/>
+        <w:t>. It</w:t>
+        <w:br/>
+        <w:t>stores, per regime key (</w:t>
+      </w:r>
+      <w:r>
+        <w:rPr>
+          <w:rFonts w:ascii="Consolas" w:hAnsi="Consolas"/>
+          <w:color w:val="334455"/>
+          <w:sz w:val="19"/>
+        </w:rPr>
+        <w:t>"all"</w:t>
+      </w:r>
+      <w:r>
+        <w:rPr/>
+        <w:t xml:space="preserve">), the signed </w:t>
+      </w:r>
+      <w:r>
+        <w:rPr>
+          <w:rFonts w:ascii="Consolas" w:hAnsi="Consolas"/>
+          <w:color w:val="334455"/>
+          <w:sz w:val="19"/>
+        </w:rPr>
+        <w:t>weights</w:t>
+      </w:r>
+      <w:r>
+        <w:rPr/>
+        <w:t xml:space="preserve">, per-factor </w:t>
+      </w:r>
+      <w:r>
+        <w:rPr>
+          <w:rFonts w:ascii="Consolas" w:hAnsi="Consolas"/>
+          <w:color w:val="334455"/>
+          <w:sz w:val="19"/>
+        </w:rPr>
+        <w:t>factor_ic</w:t>
+      </w:r>
+      <w:r>
+        <w:rPr/>
+        <w:br/>
+        <w:t>(</w:t>
+      </w:r>
+      <w:r>
+        <w:rPr>
+          <w:rFonts w:ascii="Consolas" w:hAnsi="Consolas"/>
+          <w:color w:val="334455"/>
+          <w:sz w:val="19"/>
+        </w:rPr>
+        <w:t>mean_ic</w:t>
+      </w:r>
+      <w:r>
+        <w:rPr/>
+        <w:t>/</w:t>
+      </w:r>
+      <w:r>
+        <w:rPr>
+          <w:rFonts w:ascii="Consolas" w:hAnsi="Consolas"/>
+          <w:color w:val="334455"/>
+          <w:sz w:val="19"/>
+        </w:rPr>
+        <w:t>icir</w:t>
+      </w:r>
+      <w:r>
+        <w:rPr/>
+        <w:t>/</w:t>
+      </w:r>
+      <w:r>
+        <w:rPr>
+          <w:rFonts w:ascii="Consolas" w:hAnsi="Consolas"/>
+          <w:color w:val="334455"/>
+          <w:sz w:val="19"/>
+        </w:rPr>
+        <w:t>n_days</w:t>
+      </w:r>
+      <w:r>
+        <w:rPr/>
+        <w:t xml:space="preserve">), the cross-sectional </w:t>
+      </w:r>
+      <w:r>
+        <w:rPr>
+          <w:rFonts w:ascii="Consolas" w:hAnsi="Consolas"/>
+          <w:color w:val="334455"/>
+          <w:sz w:val="19"/>
+        </w:rPr>
+        <w:t>norm</w:t>
+      </w:r>
+      <w:r>
+        <w:rPr/>
+        <w:t xml:space="preserve"> (</w:t>
+      </w:r>
+      <w:r>
+        <w:rPr>
+          <w:rFonts w:ascii="Consolas" w:hAnsi="Consolas"/>
+          <w:color w:val="334455"/>
+          <w:sz w:val="19"/>
+        </w:rPr>
+        <w:t>{factor: {mean, std}}</w:t>
+      </w:r>
+      <w:r>
+        <w:rPr/>
+        <w:t xml:space="preserve"> — the</w:t>
+        <w:br/>
+        <w:t xml:space="preserve">live scorer's primary z-score basis), the </w:t>
+      </w:r>
+      <w:r>
+        <w:rPr>
+          <w:rFonts w:ascii="Consolas" w:hAnsi="Consolas"/>
+          <w:color w:val="334455"/>
+          <w:sz w:val="19"/>
+        </w:rPr>
+        <w:t>calibration</w:t>
+      </w:r>
+      <w:r>
+        <w:rPr/>
+        <w:t xml:space="preserve"> bands</w:t>
+        <w:br/>
+        <w:t>(</w:t>
+      </w:r>
+      <w:r>
+        <w:rPr>
+          <w:rFonts w:ascii="Consolas" w:hAnsi="Consolas"/>
+          <w:color w:val="334455"/>
+          <w:sz w:val="19"/>
+        </w:rPr>
+        <w:t>{band, score_lo, score_hi, mean_fwd, hit_rate, n}</w:t>
+      </w:r>
+      <w:r>
+        <w:rPr/>
+        <w:t xml:space="preserve">), and </w:t>
+      </w:r>
+      <w:r>
+        <w:rPr>
+          <w:rFonts w:ascii="Consolas" w:hAnsi="Consolas"/>
+          <w:color w:val="334455"/>
+          <w:sz w:val="19"/>
+        </w:rPr>
+        <w:t>oos_ic</w:t>
+      </w:r>
+      <w:r>
+        <w:rPr/>
+        <w:t>/</w:t>
+      </w:r>
+      <w:r>
+        <w:rPr>
+          <w:rFonts w:ascii="Consolas" w:hAnsi="Consolas"/>
+          <w:color w:val="334455"/>
+          <w:sz w:val="19"/>
+        </w:rPr>
+        <w:t>oos_ic_by_fold</w:t>
+      </w:r>
+      <w:r>
+        <w:rPr/>
+        <w:t>/</w:t>
+        <w:br/>
+      </w:r>
+      <w:r>
+        <w:rPr>
+          <w:rFonts w:ascii="Consolas" w:hAnsi="Consolas"/>
+          <w:color w:val="334455"/>
+          <w:sz w:val="19"/>
+        </w:rPr>
+        <w:t>n_folds</w:t>
+      </w:r>
+      <w:r>
+        <w:rPr/>
+        <w:t>. A markdown research report is written alongside (</w:t>
+      </w:r>
+      <w:r>
+        <w:rPr>
+          <w:rFonts w:ascii="Consolas" w:hAnsi="Consolas"/>
+          <w:color w:val="334455"/>
+          <w:sz w:val="19"/>
+        </w:rPr>
+        <w:t>SWING_MODEL_REPORT</w:t>
+      </w:r>
+      <w:r>
+        <w:rPr/>
+        <w:t>).</w:t>
+        <w:br/>
+        <w:t>Re-running the fit (e.g. after a regime shift) is the supported maintenance path.</w:t>
+      </w:r>
+    </w:p>
     <w:p>
       <w:pPr>
         <w:pStyle w:val="Heading2"/>

</xml_diff>

<commit_message>
docs(manuals): rebuild three manuals stale since the Linux migration
Not part of the ex-dividend change -- surfaced by running build_docs.py, which
regenerates all four. The .md sources were corrected when the stack moved off
Windows/Memurai and the tracked HTML/DOCX were never rebuilt, so the SHIPPED
manuals still described the old backbone:

  api-reference       "Memurai (Redis)"                 -> "Redis"
  technical-reference "TIER 3  Redis (Memurai, :6379)"  -> "TIER 3  Redis (:6379)"
  user-guide          one line of the same drift

Source-driven, no prose written by hand. Kept separate from the ex-div commit so
neither diff has to be read through the other.

Co-Authored-By: Claude Opus 5 <noreply@anthropic.com>
</commit_message>
<xml_diff>
--- a/docs/manuals/api-reference/api-reference.docx
+++ b/docs/manuals/api-reference/api-reference.docx
@@ -32,7 +32,7 @@
           <w:color w:val="5B6678"/>
           <w:sz w:val="18"/>
         </w:rPr>
-        <w:t>WebGUI Trading with Schwab · Generated 2026-08-23</w:t>
+        <w:t>WebGUI Trading with Schwab · Generated 2026-09-06</w:t>
       </w:r>
     </w:p>
     <w:p/>
@@ -1794,7 +1794,7 @@
           <w:color w:val="223344"/>
           <w:sz w:val="18"/>
         </w:rPr>
-        <w:t>TIER 3  Redis (Memurai, :6379)  ◀──cache_set + publish──  TIER 2  services</w:t>
+        <w:t>TIER 3  Redis (:6379)  ◀──cache_set + publish──  TIER 2  services</w:t>
       </w:r>
       <w:r>
         <w:br/>
@@ -13371,7 +13371,7 @@
             <w:r/>
             <w:r>
               <w:rPr/>
-              <w:t>Memurai (Redis)</w:t>
+              <w:t>Redis</w:t>
             </w:r>
           </w:p>
         </w:tc>
@@ -14041,7 +14041,7 @@
             <w:r/>
             <w:r>
               <w:rPr/>
-              <w:t xml:space="preserve">Memurai db </w:t>
+              <w:t xml:space="preserve">Redis db </w:t>
             </w:r>
             <w:r>
               <w:rPr>
@@ -14059,7 +14059,7 @@
             <w:r/>
             <w:r>
               <w:rPr/>
-              <w:t xml:space="preserve">Memurai db </w:t>
+              <w:t xml:space="preserve">Redis db </w:t>
             </w:r>
             <w:r>
               <w:rPr>

</xml_diff>

<commit_message>
docs: the Desk market summary, the Regime hover, and a ticker toggle that only hides
Corrects the four manuals (user-guide, reference-guide, technical-reference, api-reference), page_help.py, webgui-routes.md, docs/CADENCES.md, and the 2026-09-10 design doc to match the shipped Desk MARKET SUMMARY frame, the Regime popup, the change-driven summary cadence, and the retired enable_summary/disable_summary commands. Adds a CHANGELOG entry and rebuilds the four manuals (html + docx).

Co-Authored-By: Claude Opus 5 <noreply@anthropic.com>
</commit_message>
<xml_diff>
--- a/docs/manuals/api-reference/api-reference.docx
+++ b/docs/manuals/api-reference/api-reference.docx
@@ -32,7 +32,7 @@
           <w:color w:val="5B6678"/>
           <w:sz w:val="18"/>
         </w:rPr>
-        <w:t>NeuralStrike · Generated 2026-09-07</w:t>
+        <w:t>NeuralStrike · Generated 2026-09-10</w:t>
       </w:r>
     </w:p>
     <w:p/>
@@ -4439,7 +4439,43 @@
             </w:r>
             <w:r>
               <w:rPr/>
-              <w:t xml:space="preserve"> (a short Claude-written verdict; empty when there is no key or the call failed)</w:t>
+              <w:t xml:space="preserve"> (a short Claude-written verdict; empty when there is no key or the call failed), </w:t>
+            </w:r>
+            <w:r>
+              <w:rPr>
+                <w:rFonts w:ascii="Consolas" w:hAnsi="Consolas"/>
+                <w:color w:val="334455"/>
+                <w:sz w:val="19"/>
+              </w:rPr>
+              <w:t>inputs</w:t>
+            </w:r>
+            <w:r>
+              <w:rPr/>
+              <w:t xml:space="preserve"> (the six-reading packet the sentence was written from — </w:t>
+            </w:r>
+            <w:r>
+              <w:rPr>
+                <w:rFonts w:ascii="Consolas" w:hAnsi="Consolas"/>
+                <w:color w:val="334455"/>
+                <w:sz w:val="19"/>
+              </w:rPr>
+              <w:t>{}</w:t>
+            </w:r>
+            <w:r>
+              <w:rPr/>
+              <w:t xml:space="preserve"> on an older writer), </w:t>
+            </w:r>
+            <w:r>
+              <w:rPr>
+                <w:rFonts w:ascii="Consolas" w:hAnsi="Consolas"/>
+                <w:color w:val="334455"/>
+                <w:sz w:val="19"/>
+              </w:rPr>
+              <w:t>as_of</w:t>
+            </w:r>
+            <w:r>
+              <w:rPr/>
+              <w:t xml:space="preserve"> (UTC ISO of the write)</w:t>
             </w:r>
           </w:p>
         </w:tc>
@@ -9855,7 +9891,9 @@
       </w:r>
       <w:r>
         <w:rPr/>
-        <w:t xml:space="preserve"> and the summary the bottom ticker leads with.</w:t>
+        <w:t xml:space="preserve"> and the market summary that feeds both the bottom ticker and the Desk's</w:t>
+        <w:br/>
+        <w:t>MARKET SUMMARY frame.</w:t>
       </w:r>
     </w:p>
     <w:p>
@@ -10116,7 +10154,7 @@
                 <w:color w:val="334455"/>
                 <w:sz w:val="19"/>
               </w:rPr>
-              <w:t>SUMMARY_RTH_SEC</w:t>
+              <w:t>SUMMARY_MIN_GAP_SEC</w:t>
             </w:r>
           </w:p>
         </w:tc>
@@ -10133,7 +10171,7 @@
                 <w:color w:val="334455"/>
                 <w:sz w:val="19"/>
               </w:rPr>
-              <w:t>40 * 60</w:t>
+              <w:t>10 * 60</w:t>
             </w:r>
           </w:p>
         </w:tc>
@@ -10146,7 +10184,7 @@
             <w:r/>
             <w:r>
               <w:rPr/>
-              <w:t>Claude verdict refresh during RTH.</w:t>
+              <w:t>Minimum time between two Claude summary attempts, regardless of how often the readings change.</w:t>
             </w:r>
           </w:p>
         </w:tc>
@@ -10164,7 +10202,7 @@
                 <w:color w:val="334455"/>
                 <w:sz w:val="19"/>
               </w:rPr>
-              <w:t>SUMMARY_OFFHOURS_SEC</w:t>
+              <w:t>SUMMARY_DAILY_CAP</w:t>
             </w:r>
           </w:p>
         </w:tc>
@@ -10180,7 +10218,7 @@
                 <w:color w:val="334455"/>
                 <w:sz w:val="19"/>
               </w:rPr>
-              <w:t>60 * 60</w:t>
+              <w:t>30</w:t>
             </w:r>
           </w:p>
         </w:tc>
@@ -10192,13 +10230,118 @@
             <w:r/>
             <w:r>
               <w:rPr/>
-              <w:t>Claude verdict refresh off-hours.</w:t>
+              <w:t>Maximum Claude summary attempts per CT calendar day; resets at the date change.</w:t>
             </w:r>
           </w:p>
         </w:tc>
       </w:tr>
     </w:tbl>
     <w:p/>
+    <w:p>
+      <w:r>
+        <w:rPr/>
+        <w:t xml:space="preserve">Also in </w:t>
+      </w:r>
+      <w:r>
+        <w:rPr>
+          <w:rFonts w:ascii="Consolas" w:hAnsi="Consolas"/>
+          <w:color w:val="334455"/>
+          <w:sz w:val="19"/>
+        </w:rPr>
+        <w:t>services/market_svc/compute.py</w:t>
+      </w:r>
+      <w:r>
+        <w:rPr/>
+        <w:t xml:space="preserve"> — the </w:t>
+      </w:r>
+      <w:r>
+        <w:rPr>
+          <w:b/>
+        </w:rPr>
+        <w:t>fingerprint</w:t>
+      </w:r>
+      <w:r>
+        <w:rPr/>
+        <w:t xml:space="preserve"> resolution the</w:t>
+        <w:br/>
+        <w:t xml:space="preserve">summary is written from, in </w:t>
+      </w:r>
+      <w:r>
+        <w:rPr>
+          <w:rFonts w:ascii="Consolas" w:hAnsi="Consolas"/>
+          <w:color w:val="334455"/>
+          <w:sz w:val="19"/>
+        </w:rPr>
+        <w:t>FINGERPRINT_COMPOSITE_STEP</w:t>
+      </w:r>
+      <w:r>
+        <w:rPr/>
+        <w:t xml:space="preserve"> (</w:t>
+      </w:r>
+      <w:r>
+        <w:rPr>
+          <w:rFonts w:ascii="Consolas" w:hAnsi="Consolas"/>
+          <w:color w:val="334455"/>
+          <w:sz w:val="19"/>
+        </w:rPr>
+        <w:t>0.5</w:t>
+      </w:r>
+      <w:r>
+        <w:rPr/>
+        <w:t>),</w:t>
+        <w:br/>
+      </w:r>
+      <w:r>
+        <w:rPr>
+          <w:rFonts w:ascii="Consolas" w:hAnsi="Consolas"/>
+          <w:color w:val="334455"/>
+          <w:sz w:val="19"/>
+        </w:rPr>
+        <w:t>FINGERPRINT_TREND_STEP</w:t>
+      </w:r>
+      <w:r>
+        <w:rPr/>
+        <w:t xml:space="preserve"> (</w:t>
+      </w:r>
+      <w:r>
+        <w:rPr>
+          <w:rFonts w:ascii="Consolas" w:hAnsi="Consolas"/>
+          <w:color w:val="334455"/>
+          <w:sz w:val="19"/>
+        </w:rPr>
+        <w:t>5.0</w:t>
+      </w:r>
+      <w:r>
+        <w:rPr/>
+        <w:t xml:space="preserve">) and </w:t>
+      </w:r>
+      <w:r>
+        <w:rPr>
+          <w:rFonts w:ascii="Consolas" w:hAnsi="Consolas"/>
+          <w:color w:val="334455"/>
+          <w:sz w:val="19"/>
+        </w:rPr>
+        <w:t>FINGERPRINT_CONFIDENCE_STEP</w:t>
+      </w:r>
+      <w:r>
+        <w:rPr/>
+        <w:t xml:space="preserve"> (</w:t>
+      </w:r>
+      <w:r>
+        <w:rPr>
+          <w:rFonts w:ascii="Consolas" w:hAnsi="Consolas"/>
+          <w:color w:val="334455"/>
+          <w:sz w:val="19"/>
+        </w:rPr>
+        <w:t>0.1</w:t>
+      </w:r>
+      <w:r>
+        <w:rPr/>
+        <w:t>); words</w:t>
+        <w:br/>
+        <w:t>(trend, bias, signal, regime, Bull/Bear horizon and counts) compare exactly.</w:t>
+      </w:r>
+    </w:p>
     <w:p>
       <w:r>
         <w:rPr/>
@@ -10297,8 +10440,102 @@
     </w:p>
     <w:p>
       <w:r>
+        <w:rPr>
+          <w:b/>
+        </w:rPr>
+        <w:t>The Claude summary is written on change, not on a clock</w:t>
+      </w:r>
+      <w:r>
         <w:rPr/>
-        <w:t xml:space="preserve">The Claude summary runs as a </w:t>
+        <w:t xml:space="preserve"> (2026-09-10). Each poll</w:t>
+        <w:br/>
+        <w:t>builds a packet of six readings — sentiment, trend, bias, signal, regime,</w:t>
+        <w:br/>
+        <w:t xml:space="preserve">Bull/Bear — off </w:t>
+      </w:r>
+      <w:r>
+        <w:rPr>
+          <w:rFonts w:ascii="Consolas" w:hAnsi="Consolas"/>
+          <w:color w:val="334455"/>
+          <w:sz w:val="19"/>
+        </w:rPr>
+        <w:t>cache:sentiment:composite</w:t>
+      </w:r>
+      <w:r>
+        <w:rPr/>
+        <w:t xml:space="preserve">, </w:t>
+      </w:r>
+      <w:r>
+        <w:rPr>
+          <w:rFonts w:ascii="Consolas" w:hAnsi="Consolas"/>
+          <w:color w:val="334455"/>
+          <w:sz w:val="19"/>
+        </w:rPr>
+        <w:t>:regime</w:t>
+      </w:r>
+      <w:r>
+        <w:rPr/>
+        <w:t xml:space="preserve"> and </w:t>
+      </w:r>
+      <w:r>
+        <w:rPr>
+          <w:rFonts w:ascii="Consolas" w:hAnsi="Consolas"/>
+          <w:color w:val="334455"/>
+          <w:sz w:val="19"/>
+        </w:rPr>
+        <w:t>:bullbear</w:t>
+      </w:r>
+      <w:r>
+        <w:rPr/>
+        <w:t>, and a</w:t>
+        <w:br/>
+        <w:t>fingerprint of it at the resolution above. A new sentence is written only when the</w:t>
+        <w:br/>
+        <w:t>fingerprint differs from the one the current sentence was written from, at least</w:t>
+        <w:br/>
+      </w:r>
+      <w:r>
+        <w:rPr>
+          <w:rFonts w:ascii="Consolas" w:hAnsi="Consolas"/>
+          <w:color w:val="334455"/>
+          <w:sz w:val="19"/>
+        </w:rPr>
+        <w:t>SUMMARY_MIN_GAP_SEC</w:t>
+      </w:r>
+      <w:r>
+        <w:rPr/>
+        <w:t xml:space="preserve"> has passed since the last attempt, and fewer than</w:t>
+        <w:br/>
+      </w:r>
+      <w:r>
+        <w:rPr>
+          <w:rFonts w:ascii="Consolas" w:hAnsi="Consolas"/>
+          <w:color w:val="334455"/>
+          <w:sz w:val="19"/>
+        </w:rPr>
+        <w:t>SUMMARY_DAILY_CAP</w:t>
+      </w:r>
+      <w:r>
+        <w:rPr/>
+        <w:t xml:space="preserve"> attempts have run today; the first poll after a restart with</w:t>
+        <w:br/>
+        <w:t xml:space="preserve">readings present always writes one. A </w:t>
+      </w:r>
+      <w:r>
+        <w:rPr>
+          <w:b/>
+        </w:rPr>
+        <w:t>failed</w:t>
+      </w:r>
+      <w:r>
+        <w:rPr/>
+        <w:t xml:space="preserve"> attempt (API error, timeout)</w:t>
+        <w:br/>
+        <w:t>publishes nothing — the last good sentence stays — but still counts toward the gap</w:t>
+        <w:br/>
+        <w:t>and the cap, and the same readings are retried once the gap has passed. It runs as</w:t>
+        <w:br/>
+        <w:t xml:space="preserve">a </w:t>
       </w:r>
       <w:r>
         <w:rPr>
@@ -10308,9 +10545,9 @@
       </w:r>
       <w:r>
         <w:rPr/>
-        <w:t xml:space="preserve"> rather than inline, so a slow</w:t>
+        <w:t xml:space="preserve"> rather than inline, so a slow completion cannot stall the</w:t>
         <w:br/>
-        <w:t>completion cannot stall the poll loop.</w:t>
+        <w:t>poll loop.</w:t>
       </w:r>
     </w:p>
     <w:p>
@@ -10333,6 +10570,164 @@
           <w:b/>
         </w:rPr>
         <w:t>):</w:t>
+      </w:r>
+      <w:r>
+        <w:rPr/>
+        <w:t xml:space="preserve"> none. </w:t>
+      </w:r>
+      <w:r>
+        <w:rPr>
+          <w:rFonts w:ascii="Consolas" w:hAnsi="Consolas"/>
+          <w:color w:val="334455"/>
+          <w:sz w:val="19"/>
+        </w:rPr>
+        <w:t>handle_command</w:t>
+      </w:r>
+      <w:r>
+        <w:rPr/>
+        <w:t xml:space="preserve"> dispatches nothing and ignores</w:t>
+        <w:br/>
+        <w:t xml:space="preserve">every command type, including a replayed </w:t>
+      </w:r>
+      <w:r>
+        <w:rPr>
+          <w:rFonts w:ascii="Consolas" w:hAnsi="Consolas"/>
+          <w:color w:val="334455"/>
+          <w:sz w:val="19"/>
+        </w:rPr>
+        <w:t>enable_summary</w:t>
+      </w:r>
+      <w:r>
+        <w:rPr/>
+        <w:t xml:space="preserve"> / </w:t>
+      </w:r>
+      <w:r>
+        <w:rPr>
+          <w:rFonts w:ascii="Consolas" w:hAnsi="Consolas"/>
+          <w:color w:val="334455"/>
+          <w:sz w:val="19"/>
+        </w:rPr>
+        <w:t>disable_summary</w:t>
+      </w:r>
+      <w:r>
+        <w:rPr/>
+        <w:t xml:space="preserve"> from</w:t>
+        <w:br/>
+        <w:t xml:space="preserve">an older webgui — those, and the </w:t>
+      </w:r>
+      <w:r>
+        <w:rPr>
+          <w:rFonts w:ascii="Consolas" w:hAnsi="Consolas"/>
+          <w:color w:val="334455"/>
+          <w:sz w:val="19"/>
+        </w:rPr>
+        <w:t>cache:market:summary_enabled</w:t>
+      </w:r>
+      <w:r>
+        <w:rPr/>
+        <w:t xml:space="preserve"> key and the</w:t>
+        <w:br/>
+      </w:r>
+      <w:r>
+        <w:rPr>
+          <w:rFonts w:ascii="Consolas" w:hAnsi="Consolas"/>
+          <w:color w:val="334455"/>
+          <w:sz w:val="19"/>
+        </w:rPr>
+        <w:t>SUMMARY_RTH_SEC</w:t>
+      </w:r>
+      <w:r>
+        <w:rPr/>
+        <w:t xml:space="preserve"> / </w:t>
+      </w:r>
+      <w:r>
+        <w:rPr>
+          <w:rFonts w:ascii="Consolas" w:hAnsi="Consolas"/>
+          <w:color w:val="334455"/>
+          <w:sz w:val="19"/>
+        </w:rPr>
+        <w:t>SUMMARY_OFFHOURS_SEC</w:t>
+      </w:r>
+      <w:r>
+        <w:rPr/>
+        <w:t xml:space="preserve"> clock they gated, were retired</w:t>
+        <w:br/>
+        <w:t>2026-09-10: the summary now feeds the Desk as well as the ticker, so the ticker</w:t>
+        <w:br/>
+        <w:t>toggle only hides the marquee and can no longer stop the Claude call.</w:t>
+      </w:r>
+    </w:p>
+    <w:p>
+      <w:r>
+        <w:br/>
+      </w:r>
+    </w:p>
+    <w:p>
+      <w:pPr>
+        <w:pStyle w:val="Heading1"/>
+      </w:pPr>
+      <w:r>
+        <w:rPr/>
+        <w:t>Schwab Proxy</w:t>
+      </w:r>
+    </w:p>
+    <w:p>
+      <w:r>
+        <w:rPr>
+          <w:b/>
+        </w:rPr>
+        <w:t>Entry:</w:t>
+      </w:r>
+      <w:r>
+        <w:rPr/>
+        <w:t xml:space="preserve"> </w:t>
+      </w:r>
+      <w:r>
+        <w:rPr>
+          <w:rFonts w:ascii="Consolas" w:hAnsi="Consolas"/>
+          <w:color w:val="334455"/>
+          <w:sz w:val="19"/>
+        </w:rPr>
+        <w:t>schwab-proxy/schwab_proxy.py</w:t>
+      </w:r>
+      <w:r>
+        <w:rPr/>
+        <w:t xml:space="preserve">, port </w:t>
+      </w:r>
+      <w:r>
+        <w:rPr>
+          <w:b/>
+        </w:rPr>
+        <w:t>8100</w:t>
+      </w:r>
+      <w:r>
+        <w:rPr/>
+        <w:t>. Central token manager +</w:t>
+        <w:br/>
+        <w:t>HTTP gateway. GET market-data and Trader calls are rate-limited (~200 ms spacing)</w:t>
+        <w:br/>
+        <w:t xml:space="preserve">and retried up to 3× with backoff (0.25 / 0.5 / 1.0 s); order POSTs are </w:t>
+      </w:r>
+      <w:r>
+        <w:rPr>
+          <w:b/>
+        </w:rPr>
+        <w:t>single</w:t>
+        <w:br/>
+        <w:t>attempt</w:t>
+      </w:r>
+      <w:r>
+        <w:rPr/>
+        <w:t xml:space="preserve"> (never duplicate a submitted order).</w:t>
+      </w:r>
+    </w:p>
+    <w:p>
+      <w:pPr>
+        <w:pStyle w:val="Heading2"/>
+      </w:pPr>
+      <w:r>
+        <w:rPr/>
+        <w:t>Health &amp; auth</w:t>
       </w:r>
     </w:p>
     <w:tbl>
@@ -10371,7 +10766,7 @@
               <w:rPr>
                 <w:b/>
               </w:rPr>
-              <w:t>Type</w:t>
+              <w:t>Endpoint</w:t>
             </w:r>
           </w:p>
         </w:tc>
@@ -10390,7 +10785,7 @@
               <w:rPr>
                 <w:b/>
               </w:rPr>
-              <w:t>Args</w:t>
+              <w:t>Method</w:t>
             </w:r>
           </w:p>
         </w:tc>
@@ -10409,7 +10804,7 @@
               <w:rPr>
                 <w:b/>
               </w:rPr>
-              <w:t>Effect</w:t>
+              <w:t>Returns</w:t>
             </w:r>
           </w:p>
         </w:tc>
@@ -10427,7 +10822,7 @@
                 <w:color w:val="334455"/>
                 <w:sz w:val="19"/>
               </w:rPr>
-              <w:t>enable_summary</w:t>
+              <w:t>/health</w:t>
             </w:r>
           </w:p>
         </w:tc>
@@ -10439,7 +10834,7 @@
             <w:r/>
             <w:r>
               <w:rPr/>
-              <w:t>—</w:t>
+              <w:t>GET</w:t>
             </w:r>
           </w:p>
         </w:tc>
@@ -10450,20 +10845,12 @@
           <w:p>
             <w:r/>
             <w:r>
-              <w:rPr/>
-              <w:t>Turn the Claude narrative on (</w:t>
-            </w:r>
-            <w:r>
-              <w:rPr>
-                <w:rFonts w:ascii="Consolas" w:hAnsi="Consolas"/>
-                <w:color w:val="334455"/>
-                <w:sz w:val="19"/>
-              </w:rPr>
-              <w:t>cache:market:summary_enabled</w:t>
-            </w:r>
-            <w:r>
-              <w:rPr/>
-              <w:t>).</w:t>
+              <w:rPr>
+                <w:rFonts w:ascii="Consolas" w:hAnsi="Consolas"/>
+                <w:color w:val="334455"/>
+                <w:sz w:val="19"/>
+              </w:rPr>
+              <w:t>{status, has_token, token_expired, refresh_token_expired, token_file, timestamp}</w:t>
             </w:r>
           </w:p>
         </w:tc>
@@ -10482,7 +10869,7 @@
                 <w:color w:val="334455"/>
                 <w:sz w:val="19"/>
               </w:rPr>
-              <w:t>disable_summary</w:t>
+              <w:t>/auth</w:t>
             </w:r>
           </w:p>
         </w:tc>
@@ -10495,7 +10882,7 @@
             <w:r/>
             <w:r>
               <w:rPr/>
-              <w:t>—</w:t>
+              <w:t>GET</w:t>
             </w:r>
           </w:p>
         </w:tc>
@@ -10508,7 +10895,73 @@
             <w:r/>
             <w:r>
               <w:rPr/>
-              <w:t>Turn it off. This stops the API calls, not just the display.</w:t>
+              <w:t>HTML OAuth login page</w:t>
+            </w:r>
+          </w:p>
+        </w:tc>
+      </w:tr>
+      <w:tr>
+        <w:tc>
+          <w:tcPr>
+            <w:tcW w:type="dxa" w:w="2880"/>
+          </w:tcPr>
+          <w:p>
+            <w:r/>
+            <w:r>
+              <w:rPr>
+                <w:rFonts w:ascii="Consolas" w:hAnsi="Consolas"/>
+                <w:color w:val="334455"/>
+                <w:sz w:val="19"/>
+              </w:rPr>
+              <w:t>/auth/callback</w:t>
+            </w:r>
+          </w:p>
+        </w:tc>
+        <w:tc>
+          <w:tcPr>
+            <w:tcW w:type="dxa" w:w="2880"/>
+          </w:tcPr>
+          <w:p>
+            <w:r/>
+            <w:r>
+              <w:rPr/>
+              <w:t>GET</w:t>
+            </w:r>
+          </w:p>
+        </w:tc>
+        <w:tc>
+          <w:tcPr>
+            <w:tcW w:type="dxa" w:w="2880"/>
+          </w:tcPr>
+          <w:p>
+            <w:r/>
+            <w:r>
+              <w:rPr/>
+              <w:t xml:space="preserve">Exchanges the OAuth </w:t>
+            </w:r>
+            <w:r>
+              <w:rPr>
+                <w:rFonts w:ascii="Consolas" w:hAnsi="Consolas"/>
+                <w:color w:val="334455"/>
+                <w:sz w:val="19"/>
+              </w:rPr>
+              <w:t>code</w:t>
+            </w:r>
+            <w:r>
+              <w:rPr/>
+              <w:t>/</w:t>
+            </w:r>
+            <w:r>
+              <w:rPr>
+                <w:rFonts w:ascii="Consolas" w:hAnsi="Consolas"/>
+                <w:color w:val="334455"/>
+                <w:sz w:val="19"/>
+              </w:rPr>
+              <w:t>url</w:t>
+            </w:r>
+            <w:r>
+              <w:rPr/>
+              <w:t xml:space="preserve"> for tokens</w:t>
             </w:r>
           </w:p>
         </w:tc>
@@ -10516,76 +10969,12 @@
     </w:tbl>
     <w:p/>
     <w:p>
-      <w:r>
-        <w:br/>
-      </w:r>
-    </w:p>
-    <w:p>
-      <w:pPr>
-        <w:pStyle w:val="Heading1"/>
-      </w:pPr>
-      <w:r>
-        <w:rPr/>
-        <w:t>Schwab Proxy</w:t>
-      </w:r>
-    </w:p>
-    <w:p>
-      <w:r>
-        <w:rPr>
-          <w:b/>
-        </w:rPr>
-        <w:t>Entry:</w:t>
-      </w:r>
-      <w:r>
-        <w:rPr/>
-        <w:t xml:space="preserve"> </w:t>
-      </w:r>
-      <w:r>
-        <w:rPr>
-          <w:rFonts w:ascii="Consolas" w:hAnsi="Consolas"/>
-          <w:color w:val="334455"/>
-          <w:sz w:val="19"/>
-        </w:rPr>
-        <w:t>schwab-proxy/schwab_proxy.py</w:t>
-      </w:r>
-      <w:r>
-        <w:rPr/>
-        <w:t xml:space="preserve">, port </w:t>
-      </w:r>
-      <w:r>
-        <w:rPr>
-          <w:b/>
-        </w:rPr>
-        <w:t>8100</w:t>
-      </w:r>
-      <w:r>
-        <w:rPr/>
-        <w:t>. Central token manager +</w:t>
-        <w:br/>
-        <w:t>HTTP gateway. GET market-data and Trader calls are rate-limited (~200 ms spacing)</w:t>
-        <w:br/>
-        <w:t xml:space="preserve">and retried up to 3× with backoff (0.25 / 0.5 / 1.0 s); order POSTs are </w:t>
-      </w:r>
-      <w:r>
-        <w:rPr>
-          <w:b/>
-        </w:rPr>
-        <w:t>single</w:t>
-        <w:br/>
-        <w:t>attempt</w:t>
-      </w:r>
-      <w:r>
-        <w:rPr/>
-        <w:t xml:space="preserve"> (never duplicate a submitted order).</w:t>
-      </w:r>
-    </w:p>
-    <w:p>
       <w:pPr>
         <w:pStyle w:val="Heading2"/>
       </w:pPr>
       <w:r>
         <w:rPr/>
-        <w:t>Health &amp; auth</w:t>
+        <w:t>Market data</w:t>
       </w:r>
     </w:p>
     <w:tbl>
@@ -10643,7 +11032,7 @@
               <w:rPr>
                 <w:b/>
               </w:rPr>
-              <w:t>Method</w:t>
+              <w:t>Params</w:t>
             </w:r>
           </w:p>
         </w:tc>
@@ -10680,7 +11069,7 @@
                 <w:color w:val="334455"/>
                 <w:sz w:val="19"/>
               </w:rPr>
-              <w:t>/health</w:t>
+              <w:t>/quote</w:t>
             </w:r>
           </w:p>
         </w:tc>
@@ -10691,24 +11080,24 @@
           <w:p>
             <w:r/>
             <w:r>
+              <w:rPr>
+                <w:rFonts w:ascii="Consolas" w:hAnsi="Consolas"/>
+                <w:color w:val="334455"/>
+                <w:sz w:val="19"/>
+              </w:rPr>
+              <w:t>symbol</w:t>
+            </w:r>
+          </w:p>
+        </w:tc>
+        <w:tc>
+          <w:tcPr>
+            <w:tcW w:type="dxa" w:w="2880"/>
+          </w:tcPr>
+          <w:p>
+            <w:r/>
+            <w:r>
               <w:rPr/>
-              <w:t>GET</w:t>
-            </w:r>
-          </w:p>
-        </w:tc>
-        <w:tc>
-          <w:tcPr>
-            <w:tcW w:type="dxa" w:w="2880"/>
-          </w:tcPr>
-          <w:p>
-            <w:r/>
-            <w:r>
-              <w:rPr>
-                <w:rFonts w:ascii="Consolas" w:hAnsi="Consolas"/>
-                <w:color w:val="334455"/>
-                <w:sz w:val="19"/>
-              </w:rPr>
-              <w:t>{status, has_token, token_expired, refresh_token_expired, token_file, timestamp}</w:t>
+              <w:t>Single quote</w:t>
             </w:r>
           </w:p>
         </w:tc>
@@ -10727,7 +11116,7 @@
                 <w:color w:val="334455"/>
                 <w:sz w:val="19"/>
               </w:rPr>
-              <w:t>/auth</w:t>
+              <w:t>/quotes</w:t>
             </w:r>
           </w:p>
         </w:tc>
@@ -10739,8 +11128,16 @@
           <w:p>
             <w:r/>
             <w:r>
+              <w:rPr>
+                <w:rFonts w:ascii="Consolas" w:hAnsi="Consolas"/>
+                <w:color w:val="334455"/>
+                <w:sz w:val="19"/>
+              </w:rPr>
+              <w:t>symbols</w:t>
+            </w:r>
+            <w:r>
               <w:rPr/>
-              <w:t>GET</w:t>
+              <w:t xml:space="preserve"> (comma-sep)</w:t>
             </w:r>
           </w:p>
         </w:tc>
@@ -10753,7 +11150,7 @@
             <w:r/>
             <w:r>
               <w:rPr/>
-              <w:t>HTML OAuth login page</w:t>
+              <w:t>Quotes array</w:t>
             </w:r>
           </w:p>
         </w:tc>
@@ -10771,7 +11168,7 @@
                 <w:color w:val="334455"/>
                 <w:sz w:val="19"/>
               </w:rPr>
-              <w:t>/auth/callback</w:t>
+              <w:t>/chains</w:t>
             </w:r>
           </w:p>
         </w:tc>
@@ -10782,44 +11179,188 @@
           <w:p>
             <w:r/>
             <w:r>
+              <w:rPr>
+                <w:rFonts w:ascii="Consolas" w:hAnsi="Consolas"/>
+                <w:color w:val="334455"/>
+                <w:sz w:val="19"/>
+              </w:rPr>
+              <w:t>symbol, contractType, range, fromDate?, toDate?, strikeCount?</w:t>
+            </w:r>
+          </w:p>
+        </w:tc>
+        <w:tc>
+          <w:tcPr>
+            <w:tcW w:type="dxa" w:w="2880"/>
+          </w:tcPr>
+          <w:p>
+            <w:r/>
+            <w:r>
               <w:rPr/>
-              <w:t>GET</w:t>
-            </w:r>
-          </w:p>
-        </w:tc>
+              <w:t>Options chain</w:t>
+            </w:r>
+          </w:p>
+        </w:tc>
+      </w:tr>
+      <w:tr>
         <w:tc>
           <w:tcPr>
             <w:tcW w:type="dxa" w:w="2880"/>
+            <w:shd w:val="clear" w:color="auto" w:fill="F4F6FA"/>
+          </w:tcPr>
+          <w:p>
+            <w:r/>
+            <w:r>
+              <w:rPr>
+                <w:rFonts w:ascii="Consolas" w:hAnsi="Consolas"/>
+                <w:color w:val="334455"/>
+                <w:sz w:val="19"/>
+              </w:rPr>
+              <w:t>/pricehistory</w:t>
+            </w:r>
+          </w:p>
+        </w:tc>
+        <w:tc>
+          <w:tcPr>
+            <w:tcW w:type="dxa" w:w="2880"/>
+            <w:shd w:val="clear" w:color="auto" w:fill="F4F6FA"/>
+          </w:tcPr>
+          <w:p>
+            <w:r/>
+            <w:r>
+              <w:rPr>
+                <w:rFonts w:ascii="Consolas" w:hAnsi="Consolas"/>
+                <w:color w:val="334455"/>
+                <w:sz w:val="19"/>
+              </w:rPr>
+              <w:t>symbol, periodType, period, frequencyType, frequency, needExtendedHoursData</w:t>
+            </w:r>
+          </w:p>
+        </w:tc>
+        <w:tc>
+          <w:tcPr>
+            <w:tcW w:type="dxa" w:w="2880"/>
+            <w:shd w:val="clear" w:color="auto" w:fill="F4F6FA"/>
           </w:tcPr>
           <w:p>
             <w:r/>
             <w:r>
               <w:rPr/>
-              <w:t xml:space="preserve">Exchanges the OAuth </w:t>
-            </w:r>
-            <w:r>
-              <w:rPr>
-                <w:rFonts w:ascii="Consolas" w:hAnsi="Consolas"/>
-                <w:color w:val="334455"/>
-                <w:sz w:val="19"/>
-              </w:rPr>
-              <w:t>code</w:t>
+              <w:t>Price bars</w:t>
+            </w:r>
+          </w:p>
+        </w:tc>
+      </w:tr>
+      <w:tr>
+        <w:tc>
+          <w:tcPr>
+            <w:tcW w:type="dxa" w:w="2880"/>
+          </w:tcPr>
+          <w:p>
+            <w:r/>
+            <w:r>
+              <w:rPr>
+                <w:rFonts w:ascii="Consolas" w:hAnsi="Consolas"/>
+                <w:color w:val="334455"/>
+                <w:sz w:val="19"/>
+              </w:rPr>
+              <w:t>/instruments</w:t>
+            </w:r>
+          </w:p>
+        </w:tc>
+        <w:tc>
+          <w:tcPr>
+            <w:tcW w:type="dxa" w:w="2880"/>
+          </w:tcPr>
+          <w:p>
+            <w:r/>
+            <w:r>
+              <w:rPr>
+                <w:rFonts w:ascii="Consolas" w:hAnsi="Consolas"/>
+                <w:color w:val="334455"/>
+                <w:sz w:val="19"/>
+              </w:rPr>
+              <w:t>symbol, projection</w:t>
             </w:r>
             <w:r>
               <w:rPr/>
-              <w:t>/</w:t>
-            </w:r>
-            <w:r>
-              <w:rPr>
-                <w:rFonts w:ascii="Consolas" w:hAnsi="Consolas"/>
-                <w:color w:val="334455"/>
-                <w:sz w:val="19"/>
-              </w:rPr>
-              <w:t>url</w:t>
+              <w:t xml:space="preserve"> (e.g. </w:t>
+            </w:r>
+            <w:r>
+              <w:rPr>
+                <w:rFonts w:ascii="Consolas" w:hAnsi="Consolas"/>
+                <w:color w:val="334455"/>
+                <w:sz w:val="19"/>
+              </w:rPr>
+              <w:t>fundamental</w:t>
             </w:r>
             <w:r>
               <w:rPr/>
-              <w:t xml:space="preserve"> for tokens</w:t>
+              <w:t>)</w:t>
+            </w:r>
+          </w:p>
+        </w:tc>
+        <w:tc>
+          <w:tcPr>
+            <w:tcW w:type="dxa" w:w="2880"/>
+          </w:tcPr>
+          <w:p>
+            <w:r/>
+            <w:r>
+              <w:rPr>
+                <w:rFonts w:ascii="Consolas" w:hAnsi="Consolas"/>
+                <w:color w:val="334455"/>
+                <w:sz w:val="19"/>
+              </w:rPr>
+              <w:t>{instruments:[{fundamental, symbol, description, ...}]}</w:t>
+            </w:r>
+          </w:p>
+        </w:tc>
+      </w:tr>
+      <w:tr>
+        <w:tc>
+          <w:tcPr>
+            <w:tcW w:type="dxa" w:w="2880"/>
+            <w:shd w:val="clear" w:color="auto" w:fill="F4F6FA"/>
+          </w:tcPr>
+          <w:p>
+            <w:r/>
+            <w:r>
+              <w:rPr>
+                <w:rFonts w:ascii="Consolas" w:hAnsi="Consolas"/>
+                <w:color w:val="334455"/>
+                <w:sz w:val="19"/>
+              </w:rPr>
+              <w:t>/passthrough</w:t>
+            </w:r>
+          </w:p>
+        </w:tc>
+        <w:tc>
+          <w:tcPr>
+            <w:tcW w:type="dxa" w:w="2880"/>
+            <w:shd w:val="clear" w:color="auto" w:fill="F4F6FA"/>
+          </w:tcPr>
+          <w:p>
+            <w:r/>
+            <w:r>
+              <w:rPr>
+                <w:rFonts w:ascii="Consolas" w:hAnsi="Consolas"/>
+                <w:color w:val="334455"/>
+                <w:sz w:val="19"/>
+              </w:rPr>
+              <w:t>endpoint, params</w:t>
+            </w:r>
+          </w:p>
+        </w:tc>
+        <w:tc>
+          <w:tcPr>
+            <w:tcW w:type="dxa" w:w="2880"/>
+            <w:shd w:val="clear" w:color="auto" w:fill="F4F6FA"/>
+          </w:tcPr>
+          <w:p>
+            <w:r/>
+            <w:r>
+              <w:rPr/>
+              <w:t>Generic marketdata fallback</w:t>
             </w:r>
           </w:p>
         </w:tc>
@@ -10827,12 +11368,30 @@
     </w:tbl>
     <w:p/>
     <w:p>
+      <w:r>
+        <w:rPr/>
+        <w:t xml:space="preserve">All return </w:t>
+      </w:r>
+      <w:r>
+        <w:rPr>
+          <w:rFonts w:ascii="Consolas" w:hAnsi="Consolas"/>
+          <w:color w:val="334455"/>
+          <w:sz w:val="19"/>
+        </w:rPr>
+        <w:t>{status_code, data, error}</w:t>
+      </w:r>
+      <w:r>
+        <w:rPr/>
+        <w:t>.</w:t>
+      </w:r>
+    </w:p>
+    <w:p>
       <w:pPr>
         <w:pStyle w:val="Heading2"/>
       </w:pPr>
       <w:r>
         <w:rPr/>
-        <w:t>Market data</w:t>
+        <w:t>Trader API</w:t>
       </w:r>
     </w:p>
     <w:tbl>
@@ -10890,7 +11449,7 @@
               <w:rPr>
                 <w:b/>
               </w:rPr>
-              <w:t>Params</w:t>
+              <w:t>Method</w:t>
             </w:r>
           </w:p>
         </w:tc>
@@ -10927,7 +11486,7 @@
                 <w:color w:val="334455"/>
                 <w:sz w:val="19"/>
               </w:rPr>
-              <w:t>/quote</w:t>
+              <w:t>/accounts</w:t>
             </w:r>
           </w:p>
         </w:tc>
@@ -10938,12 +11497,8 @@
           <w:p>
             <w:r/>
             <w:r>
-              <w:rPr>
-                <w:rFonts w:ascii="Consolas" w:hAnsi="Consolas"/>
-                <w:color w:val="334455"/>
-                <w:sz w:val="19"/>
-              </w:rPr>
-              <w:t>symbol</w:t>
+              <w:rPr/>
+              <w:t>GET</w:t>
             </w:r>
           </w:p>
         </w:tc>
@@ -10954,8 +11509,12 @@
           <w:p>
             <w:r/>
             <w:r>
-              <w:rPr/>
-              <w:t>Single quote</w:t>
+              <w:rPr>
+                <w:rFonts w:ascii="Consolas" w:hAnsi="Consolas"/>
+                <w:color w:val="334455"/>
+                <w:sz w:val="19"/>
+              </w:rPr>
+              <w:t>[{hashValue, accountNumber, ...}]</w:t>
             </w:r>
           </w:p>
         </w:tc>
@@ -10974,7 +11533,7 @@
                 <w:color w:val="334455"/>
                 <w:sz w:val="19"/>
               </w:rPr>
-              <w:t>/quotes</w:t>
+              <w:t>/positions/{account_hash}</w:t>
             </w:r>
           </w:p>
         </w:tc>
@@ -10986,16 +11545,8 @@
           <w:p>
             <w:r/>
             <w:r>
-              <w:rPr>
-                <w:rFonts w:ascii="Consolas" w:hAnsi="Consolas"/>
-                <w:color w:val="334455"/>
-                <w:sz w:val="19"/>
-              </w:rPr>
-              <w:t>symbols</w:t>
-            </w:r>
-            <w:r>
               <w:rPr/>
-              <w:t xml:space="preserve"> (comma-sep)</w:t>
+              <w:t>GET</w:t>
             </w:r>
           </w:p>
         </w:tc>
@@ -11008,7 +11559,7 @@
             <w:r/>
             <w:r>
               <w:rPr/>
-              <w:t>Quotes array</w:t>
+              <w:t>Normalized positions (net qty; options carry underlying)</w:t>
             </w:r>
           </w:p>
         </w:tc>
@@ -11026,7 +11577,7 @@
                 <w:color w:val="334455"/>
                 <w:sz w:val="19"/>
               </w:rPr>
-              <w:t>/chains</w:t>
+              <w:t>/transactions/{account_hash}</w:t>
             </w:r>
           </w:p>
         </w:tc>
@@ -11037,12 +11588,20 @@
           <w:p>
             <w:r/>
             <w:r>
-              <w:rPr>
-                <w:rFonts w:ascii="Consolas" w:hAnsi="Consolas"/>
-                <w:color w:val="334455"/>
-                <w:sz w:val="19"/>
-              </w:rPr>
-              <w:t>symbol, contractType, range, fromDate?, toDate?, strikeCount?</w:t>
+              <w:rPr/>
+              <w:t>GET (</w:t>
+            </w:r>
+            <w:r>
+              <w:rPr>
+                <w:rFonts w:ascii="Consolas" w:hAnsi="Consolas"/>
+                <w:color w:val="334455"/>
+                <w:sz w:val="19"/>
+              </w:rPr>
+              <w:t>start_date, end_date</w:t>
+            </w:r>
+            <w:r>
+              <w:rPr/>
+              <w:t>)</w:t>
             </w:r>
           </w:p>
         </w:tc>
@@ -11054,7 +11613,7 @@
             <w:r/>
             <w:r>
               <w:rPr/>
-              <w:t>Options chain</w:t>
+              <w:t>Normalized TRADE transactions</w:t>
             </w:r>
           </w:p>
         </w:tc>
@@ -11073,7 +11632,7 @@
                 <w:color w:val="334455"/>
                 <w:sz w:val="19"/>
               </w:rPr>
-              <w:t>/pricehistory</w:t>
+              <w:t>/orders/{account_hash}</w:t>
             </w:r>
           </w:p>
         </w:tc>
@@ -11085,12 +11644,8 @@
           <w:p>
             <w:r/>
             <w:r>
-              <w:rPr>
-                <w:rFonts w:ascii="Consolas" w:hAnsi="Consolas"/>
-                <w:color w:val="334455"/>
-                <w:sz w:val="19"/>
-              </w:rPr>
-              <w:t>symbol, periodType, period, frequencyType, frequency, needExtendedHoursData</w:t>
+              <w:rPr/>
+              <w:t>POST (Schwab order body)</w:t>
             </w:r>
           </w:p>
         </w:tc>
@@ -11102,123 +11657,12 @@
           <w:p>
             <w:r/>
             <w:r>
-              <w:rPr/>
-              <w:t>Price bars</w:t>
-            </w:r>
-          </w:p>
-        </w:tc>
-      </w:tr>
-      <w:tr>
-        <w:tc>
-          <w:tcPr>
-            <w:tcW w:type="dxa" w:w="2880"/>
-          </w:tcPr>
-          <w:p>
-            <w:r/>
-            <w:r>
-              <w:rPr>
-                <w:rFonts w:ascii="Consolas" w:hAnsi="Consolas"/>
-                <w:color w:val="334455"/>
-                <w:sz w:val="19"/>
-              </w:rPr>
-              <w:t>/instruments</w:t>
-            </w:r>
-          </w:p>
-        </w:tc>
-        <w:tc>
-          <w:tcPr>
-            <w:tcW w:type="dxa" w:w="2880"/>
-          </w:tcPr>
-          <w:p>
-            <w:r/>
-            <w:r>
-              <w:rPr>
-                <w:rFonts w:ascii="Consolas" w:hAnsi="Consolas"/>
-                <w:color w:val="334455"/>
-                <w:sz w:val="19"/>
-              </w:rPr>
-              <w:t>symbol, projection</w:t>
-            </w:r>
-            <w:r>
-              <w:rPr/>
-              <w:t xml:space="preserve"> (e.g. </w:t>
-            </w:r>
-            <w:r>
-              <w:rPr>
-                <w:rFonts w:ascii="Consolas" w:hAnsi="Consolas"/>
-                <w:color w:val="334455"/>
-                <w:sz w:val="19"/>
-              </w:rPr>
-              <w:t>fundamental</w:t>
-            </w:r>
-            <w:r>
-              <w:rPr/>
-              <w:t>)</w:t>
-            </w:r>
-          </w:p>
-        </w:tc>
-        <w:tc>
-          <w:tcPr>
-            <w:tcW w:type="dxa" w:w="2880"/>
-          </w:tcPr>
-          <w:p>
-            <w:r/>
-            <w:r>
-              <w:rPr>
-                <w:rFonts w:ascii="Consolas" w:hAnsi="Consolas"/>
-                <w:color w:val="334455"/>
-                <w:sz w:val="19"/>
-              </w:rPr>
-              <w:t>{instruments:[{fundamental, symbol, description, ...}]}</w:t>
-            </w:r>
-          </w:p>
-        </w:tc>
-      </w:tr>
-      <w:tr>
-        <w:tc>
-          <w:tcPr>
-            <w:tcW w:type="dxa" w:w="2880"/>
-            <w:shd w:val="clear" w:color="auto" w:fill="F4F6FA"/>
-          </w:tcPr>
-          <w:p>
-            <w:r/>
-            <w:r>
-              <w:rPr>
-                <w:rFonts w:ascii="Consolas" w:hAnsi="Consolas"/>
-                <w:color w:val="334455"/>
-                <w:sz w:val="19"/>
-              </w:rPr>
-              <w:t>/passthrough</w:t>
-            </w:r>
-          </w:p>
-        </w:tc>
-        <w:tc>
-          <w:tcPr>
-            <w:tcW w:type="dxa" w:w="2880"/>
-            <w:shd w:val="clear" w:color="auto" w:fill="F4F6FA"/>
-          </w:tcPr>
-          <w:p>
-            <w:r/>
-            <w:r>
-              <w:rPr>
-                <w:rFonts w:ascii="Consolas" w:hAnsi="Consolas"/>
-                <w:color w:val="334455"/>
-                <w:sz w:val="19"/>
-              </w:rPr>
-              <w:t>endpoint, params</w:t>
-            </w:r>
-          </w:p>
-        </w:tc>
-        <w:tc>
-          <w:tcPr>
-            <w:tcW w:type="dxa" w:w="2880"/>
-            <w:shd w:val="clear" w:color="auto" w:fill="F4F6FA"/>
-          </w:tcPr>
-          <w:p>
-            <w:r/>
-            <w:r>
-              <w:rPr/>
-              <w:t>Generic marketdata fallback</w:t>
+              <w:rPr>
+                <w:rFonts w:ascii="Consolas" w:hAnsi="Consolas"/>
+                <w:color w:val="334455"/>
+                <w:sz w:val="19"/>
+              </w:rPr>
+              <w:t>{status: "submitted", status_code, data}</w:t>
             </w:r>
           </w:p>
         </w:tc>
@@ -11226,30 +11670,20 @@
     </w:tbl>
     <w:p/>
     <w:p>
-      <w:r>
-        <w:rPr/>
-        <w:t xml:space="preserve">All return </w:t>
-      </w:r>
-      <w:r>
-        <w:rPr>
-          <w:rFonts w:ascii="Consolas" w:hAnsi="Consolas"/>
-          <w:color w:val="334455"/>
-          <w:sz w:val="19"/>
-        </w:rPr>
-        <w:t>{status_code, data, error}</w:t>
-      </w:r>
-      <w:r>
-        <w:rPr/>
-        <w:t>.</w:t>
-      </w:r>
-    </w:p>
-    <w:p>
       <w:pPr>
         <w:pStyle w:val="Heading2"/>
       </w:pPr>
       <w:r>
         <w:rPr/>
-        <w:t>Trader API</w:t>
+        <w:t>Trade-stream tracker</w:t>
+      </w:r>
+    </w:p>
+    <w:p>
+      <w:r>
+        <w:rPr/>
+        <w:t>Daemon threads register paper trades and stream option ticks (degrade gracefully if</w:t>
+        <w:br/>
+        <w:t>streaming fails).</w:t>
       </w:r>
     </w:p>
     <w:tbl>
@@ -11326,298 +11760,6 @@
               <w:rPr>
                 <w:b/>
               </w:rPr>
-              <w:t>Returns</w:t>
-            </w:r>
-          </w:p>
-        </w:tc>
-      </w:tr>
-      <w:tr>
-        <w:tc>
-          <w:tcPr>
-            <w:tcW w:type="dxa" w:w="2880"/>
-          </w:tcPr>
-          <w:p>
-            <w:r/>
-            <w:r>
-              <w:rPr>
-                <w:rFonts w:ascii="Consolas" w:hAnsi="Consolas"/>
-                <w:color w:val="334455"/>
-                <w:sz w:val="19"/>
-              </w:rPr>
-              <w:t>/accounts</w:t>
-            </w:r>
-          </w:p>
-        </w:tc>
-        <w:tc>
-          <w:tcPr>
-            <w:tcW w:type="dxa" w:w="2880"/>
-          </w:tcPr>
-          <w:p>
-            <w:r/>
-            <w:r>
-              <w:rPr/>
-              <w:t>GET</w:t>
-            </w:r>
-          </w:p>
-        </w:tc>
-        <w:tc>
-          <w:tcPr>
-            <w:tcW w:type="dxa" w:w="2880"/>
-          </w:tcPr>
-          <w:p>
-            <w:r/>
-            <w:r>
-              <w:rPr>
-                <w:rFonts w:ascii="Consolas" w:hAnsi="Consolas"/>
-                <w:color w:val="334455"/>
-                <w:sz w:val="19"/>
-              </w:rPr>
-              <w:t>[{hashValue, accountNumber, ...}]</w:t>
-            </w:r>
-          </w:p>
-        </w:tc>
-      </w:tr>
-      <w:tr>
-        <w:tc>
-          <w:tcPr>
-            <w:tcW w:type="dxa" w:w="2880"/>
-            <w:shd w:val="clear" w:color="auto" w:fill="F4F6FA"/>
-          </w:tcPr>
-          <w:p>
-            <w:r/>
-            <w:r>
-              <w:rPr>
-                <w:rFonts w:ascii="Consolas" w:hAnsi="Consolas"/>
-                <w:color w:val="334455"/>
-                <w:sz w:val="19"/>
-              </w:rPr>
-              <w:t>/positions/{account_hash}</w:t>
-            </w:r>
-          </w:p>
-        </w:tc>
-        <w:tc>
-          <w:tcPr>
-            <w:tcW w:type="dxa" w:w="2880"/>
-            <w:shd w:val="clear" w:color="auto" w:fill="F4F6FA"/>
-          </w:tcPr>
-          <w:p>
-            <w:r/>
-            <w:r>
-              <w:rPr/>
-              <w:t>GET</w:t>
-            </w:r>
-          </w:p>
-        </w:tc>
-        <w:tc>
-          <w:tcPr>
-            <w:tcW w:type="dxa" w:w="2880"/>
-            <w:shd w:val="clear" w:color="auto" w:fill="F4F6FA"/>
-          </w:tcPr>
-          <w:p>
-            <w:r/>
-            <w:r>
-              <w:rPr/>
-              <w:t>Normalized positions (net qty; options carry underlying)</w:t>
-            </w:r>
-          </w:p>
-        </w:tc>
-      </w:tr>
-      <w:tr>
-        <w:tc>
-          <w:tcPr>
-            <w:tcW w:type="dxa" w:w="2880"/>
-          </w:tcPr>
-          <w:p>
-            <w:r/>
-            <w:r>
-              <w:rPr>
-                <w:rFonts w:ascii="Consolas" w:hAnsi="Consolas"/>
-                <w:color w:val="334455"/>
-                <w:sz w:val="19"/>
-              </w:rPr>
-              <w:t>/transactions/{account_hash}</w:t>
-            </w:r>
-          </w:p>
-        </w:tc>
-        <w:tc>
-          <w:tcPr>
-            <w:tcW w:type="dxa" w:w="2880"/>
-          </w:tcPr>
-          <w:p>
-            <w:r/>
-            <w:r>
-              <w:rPr/>
-              <w:t>GET (</w:t>
-            </w:r>
-            <w:r>
-              <w:rPr>
-                <w:rFonts w:ascii="Consolas" w:hAnsi="Consolas"/>
-                <w:color w:val="334455"/>
-                <w:sz w:val="19"/>
-              </w:rPr>
-              <w:t>start_date, end_date</w:t>
-            </w:r>
-            <w:r>
-              <w:rPr/>
-              <w:t>)</w:t>
-            </w:r>
-          </w:p>
-        </w:tc>
-        <w:tc>
-          <w:tcPr>
-            <w:tcW w:type="dxa" w:w="2880"/>
-          </w:tcPr>
-          <w:p>
-            <w:r/>
-            <w:r>
-              <w:rPr/>
-              <w:t>Normalized TRADE transactions</w:t>
-            </w:r>
-          </w:p>
-        </w:tc>
-      </w:tr>
-      <w:tr>
-        <w:tc>
-          <w:tcPr>
-            <w:tcW w:type="dxa" w:w="2880"/>
-            <w:shd w:val="clear" w:color="auto" w:fill="F4F6FA"/>
-          </w:tcPr>
-          <w:p>
-            <w:r/>
-            <w:r>
-              <w:rPr>
-                <w:rFonts w:ascii="Consolas" w:hAnsi="Consolas"/>
-                <w:color w:val="334455"/>
-                <w:sz w:val="19"/>
-              </w:rPr>
-              <w:t>/orders/{account_hash}</w:t>
-            </w:r>
-          </w:p>
-        </w:tc>
-        <w:tc>
-          <w:tcPr>
-            <w:tcW w:type="dxa" w:w="2880"/>
-            <w:shd w:val="clear" w:color="auto" w:fill="F4F6FA"/>
-          </w:tcPr>
-          <w:p>
-            <w:r/>
-            <w:r>
-              <w:rPr/>
-              <w:t>POST (Schwab order body)</w:t>
-            </w:r>
-          </w:p>
-        </w:tc>
-        <w:tc>
-          <w:tcPr>
-            <w:tcW w:type="dxa" w:w="2880"/>
-            <w:shd w:val="clear" w:color="auto" w:fill="F4F6FA"/>
-          </w:tcPr>
-          <w:p>
-            <w:r/>
-            <w:r>
-              <w:rPr>
-                <w:rFonts w:ascii="Consolas" w:hAnsi="Consolas"/>
-                <w:color w:val="334455"/>
-                <w:sz w:val="19"/>
-              </w:rPr>
-              <w:t>{status: "submitted", status_code, data}</w:t>
-            </w:r>
-          </w:p>
-        </w:tc>
-      </w:tr>
-    </w:tbl>
-    <w:p/>
-    <w:p>
-      <w:pPr>
-        <w:pStyle w:val="Heading2"/>
-      </w:pPr>
-      <w:r>
-        <w:rPr/>
-        <w:t>Trade-stream tracker</w:t>
-      </w:r>
-    </w:p>
-    <w:p>
-      <w:r>
-        <w:rPr/>
-        <w:t>Daemon threads register paper trades and stream option ticks (degrade gracefully if</w:t>
-        <w:br/>
-        <w:t>streaming fails).</w:t>
-      </w:r>
-    </w:p>
-    <w:tbl>
-      <w:tblPr>
-        <w:tblW w:type="auto" w:w="0"/>
-        <w:jc w:val="left"/>
-        <w:tblLayout w:type="autofit"/>
-        <w:tblLook w:firstColumn="1" w:firstRow="1" w:lastColumn="0" w:lastRow="0" w:noHBand="0" w:noVBand="1" w:val="04A0"/>
-        <w:tblBorders>
-          <w:top w:val="single" w:sz="4" w:space="0" w:color="D8DEE9"/>
-          <w:left w:val="single" w:sz="4" w:space="0" w:color="D8DEE9"/>
-          <w:bottom w:val="single" w:sz="4" w:space="0" w:color="D8DEE9"/>
-          <w:right w:val="single" w:sz="4" w:space="0" w:color="D8DEE9"/>
-          <w:insideH w:val="single" w:sz="4" w:space="0" w:color="D8DEE9"/>
-          <w:insideV w:val="single" w:sz="4" w:space="0" w:color="D8DEE9"/>
-        </w:tblBorders>
-      </w:tblPr>
-      <w:tblGrid>
-        <w:gridCol w:w="2880"/>
-        <w:gridCol w:w="2880"/>
-        <w:gridCol w:w="2880"/>
-      </w:tblGrid>
-      <w:tr>
-        <w:tc>
-          <w:tcPr>
-            <w:tcW w:type="dxa" w:w="2880"/>
-            <w:shd w:val="clear" w:color="auto" w:fill="EAF2FB"/>
-          </w:tcPr>
-          <w:p>
-            <w:r>
-              <w:rPr>
-                <w:b/>
-              </w:rPr>
-            </w:r>
-            <w:r>
-              <w:rPr>
-                <w:b/>
-              </w:rPr>
-              <w:t>Endpoint</w:t>
-            </w:r>
-          </w:p>
-        </w:tc>
-        <w:tc>
-          <w:tcPr>
-            <w:tcW w:type="dxa" w:w="2880"/>
-            <w:shd w:val="clear" w:color="auto" w:fill="EAF2FB"/>
-          </w:tcPr>
-          <w:p>
-            <w:r>
-              <w:rPr>
-                <w:b/>
-              </w:rPr>
-            </w:r>
-            <w:r>
-              <w:rPr>
-                <w:b/>
-              </w:rPr>
-              <w:t>Method</w:t>
-            </w:r>
-          </w:p>
-        </w:tc>
-        <w:tc>
-          <w:tcPr>
-            <w:tcW w:type="dxa" w:w="2880"/>
-            <w:shd w:val="clear" w:color="auto" w:fill="EAF2FB"/>
-          </w:tcPr>
-          <w:p>
-            <w:r>
-              <w:rPr>
-                <w:b/>
-              </w:rPr>
-            </w:r>
-            <w:r>
-              <w:rPr>
-                <w:b/>
-              </w:rPr>
               <w:t>Body</w:t>
             </w:r>
           </w:p>
@@ -12502,17 +12644,6 @@
           <w:sz w:val="18"/>
         </w:rPr>
         <w:t>cache:market:summary           events:market:summary          (MarketSummary)</w:t>
-      </w:r>
-      <w:r>
-        <w:br/>
-      </w:r>
-      <w:r>
-        <w:rPr>
-          <w:rFonts w:ascii="Consolas" w:hAnsi="Consolas"/>
-          <w:color w:val="223344"/>
-          <w:sz w:val="18"/>
-        </w:rPr>
-        <w:t>cache:market:summary_enabled                                  (ticker/Claude toggle)</w:t>
       </w:r>
       <w:r>
         <w:br/>

</xml_diff>

<commit_message>
feat(market_svc): the summary's facts are stated by the code, not the model
Every paraphrase bent a reading - the 21:05 CT sentence called Gliding
prices drifting lower on absent buyers when sellers are what is absent.
compute.summary_facts now writes one fixed plain-English statement per
reading (sentiment by signal word, position size, trend, regime, sector
counts from the ready-made totals). Claude is sent only those statements,
joins them and adds one closing posture; generate_summary withholds a
reply that drops or rewords any fact (_missing_fact), after the cut-off,
spread-direction and sector-count checks. No facts, no call. The meaning
tables are gone; the mirror test pins the fact tables' keys against the
trend, regime and signal words the screen can show. Still one call per
change. Verified against the live API on two packets before shipping.

Co-Authored-By: Claude Opus 5 <noreply@anthropic.com>
</commit_message>
<xml_diff>
--- a/docs/manuals/api-reference/api-reference.docx
+++ b/docs/manuals/api-reference/api-reference.docx
@@ -10519,7 +10519,23 @@
         <w:rPr/>
         <w:t xml:space="preserve"> attempts have run today; the first poll after a restart with</w:t>
         <w:br/>
-        <w:t xml:space="preserve">readings present always writes one. A </w:t>
+        <w:t>readings present always writes one. The model is sent only</w:t>
+        <w:br/>
+      </w:r>
+      <w:r>
+        <w:rPr>
+          <w:rFonts w:ascii="Consolas" w:hAnsi="Consolas"/>
+          <w:color w:val="334455"/>
+          <w:sz w:val="19"/>
+        </w:rPr>
+        <w:t>{"facts": summary_facts(packet)}</w:t>
+      </w:r>
+      <w:r>
+        <w:rPr/>
+        <w:t xml:space="preserve"> — one plain-English statement per reading,</w:t>
+        <w:br/>
+        <w:t>written by the code — and may only join them and add a closing posture. A</w:t>
+        <w:br/>
       </w:r>
       <w:r>
         <w:rPr>
@@ -10529,11 +10545,25 @@
       </w:r>
       <w:r>
         <w:rPr/>
-        <w:t xml:space="preserve"> attempt (API error, timeout)</w:t>
+        <w:t xml:space="preserve"> attempt (API error, timeout) or a </w:t>
+      </w:r>
+      <w:r>
+        <w:rPr>
+          <w:b/>
+        </w:rPr>
+        <w:t>withheld</w:t>
+      </w:r>
+      <w:r>
+        <w:rPr/>
+        <w:t xml:space="preserve"> reply (a fact dropped or</w:t>
         <w:br/>
-        <w:t>publishes nothing — the last good sentence stays — but still counts toward the gap</w:t>
+        <w:t>reworded, a wrong sector count, a credit spread tied to the wrong direction, or a</w:t>
         <w:br/>
-        <w:t>and the cap, and the same readings are retried once the gap has passed. It runs as</w:t>
+        <w:t>cut-off reply with no complete sentence) publishes nothing — the last good</w:t>
+        <w:br/>
+        <w:t>sentence stays — but still counts toward the gap and the cap, and the same</w:t>
+        <w:br/>
+        <w:t>readings are retried once the gap has passed. It runs as</w:t>
         <w:br/>
         <w:t xml:space="preserve">a </w:t>
       </w:r>

</xml_diff>

<commit_message>
docs(simulator): the guide, manuals, routes and changelog describe the new screen
page_help (the in-app guide) and all four manuals now describe Load chain,
the six position tiles, Set all legs to, the Edited chip and warnings, the
fitted Days slider and its snaps, the IV-shock table, Replay's P/L panel, and
position units. The API reference documents sim_run's echoed inputs and
sim_replay's value/pnl. CLAUDE.md gains the ui.slider _props gotcha behind the
stuck Replay scrubber. Manual HTML/Word rebuilt (the glossary's date-only
rebuild left out).

Co-Authored-By: Claude Opus 5 <noreply@anthropic.com>
</commit_message>
<xml_diff>
--- a/docs/manuals/api-reference/api-reference.docx
+++ b/docs/manuals/api-reference/api-reference.docx
@@ -32,7 +32,7 @@
           <w:color w:val="5B6678"/>
           <w:sz w:val="18"/>
         </w:rPr>
-        <w:t>NeuralStrike · Generated 2026-09-10</w:t>
+        <w:t>NeuralStrike · Generated 2026-09-11</w:t>
       </w:r>
     </w:p>
     <w:p/>
@@ -6804,6 +6804,22 @@
               </w:rPr>
               <w:t>cache:options:sim_result</w:t>
             </w:r>
+            <w:r>
+              <w:rPr/>
+              <w:t xml:space="preserve"> — </w:t>
+            </w:r>
+            <w:r>
+              <w:rPr>
+                <w:rFonts w:ascii="Consolas" w:hAnsi="Consolas"/>
+                <w:color w:val="334455"/>
+                <w:sz w:val="19"/>
+              </w:rPr>
+              <w:t>{spot, symbol, legs, dt, mult, whatif_rows, whatif_baseline, ivshock: {base, shock, units: "position"}}</w:t>
+            </w:r>
+            <w:r>
+              <w:rPr/>
+              <w:t>; the four inputs are echoed so a reader can match a result to what it asked for</w:t>
+            </w:r>
           </w:p>
         </w:tc>
       </w:tr>
@@ -6857,6 +6873,46 @@
                 <w:sz w:val="19"/>
               </w:rPr>
               <w:t>cache:options:sim_replay</w:t>
+            </w:r>
+            <w:r>
+              <w:rPr/>
+              <w:t xml:space="preserve"> — adds </w:t>
+            </w:r>
+            <w:r>
+              <w:rPr>
+                <w:rFonts w:ascii="Consolas" w:hAnsi="Consolas"/>
+                <w:color w:val="334455"/>
+                <w:sz w:val="19"/>
+              </w:rPr>
+              <w:t>value</w:t>
+            </w:r>
+            <w:r>
+              <w:rPr/>
+              <w:t xml:space="preserve"> + </w:t>
+            </w:r>
+            <w:r>
+              <w:rPr>
+                <w:rFonts w:ascii="Consolas" w:hAnsi="Consolas"/>
+                <w:color w:val="334455"/>
+                <w:sz w:val="19"/>
+              </w:rPr>
+              <w:t>pnl</w:t>
+            </w:r>
+            <w:r>
+              <w:rPr/>
+              <w:t xml:space="preserve"> per bar and </w:t>
+            </w:r>
+            <w:r>
+              <w:rPr>
+                <w:rFonts w:ascii="Consolas" w:hAnsi="Consolas"/>
+                <w:color w:val="334455"/>
+                <w:sz w:val="19"/>
+              </w:rPr>
+              <w:t>units: "position"</w:t>
+            </w:r>
+            <w:r>
+              <w:rPr/>
+              <w:t xml:space="preserve"> (Greeks × 100 × qty)</w:t>
             </w:r>
           </w:p>
         </w:tc>

</xml_diff>